<commit_message>
perf: add Redis caching layer and nine-panel analytics center
</commit_message>
<xml_diff>
--- a/docs/技术实施文档.docx
+++ b/docs/技术实施文档.docx
@@ -1481,7 +1481,7 @@
         <w:spacing w:after="80"/>
       </w:pPr>
       <w:r>
-        <w:t>#### 3.8.2 后台数据治理与内容管理</w:t>
+        <w:t>#### 3.8.2 Redis 缓存与性能优化</w:t>
       </w:r>
     </w:p>
     <w:p>
@@ -1489,6 +1489,256 @@
         <w:spacing w:after="80"/>
       </w:pPr>
       <w:r>
+        <w:t xml:space="preserve">十万级数据规模下，若每次请求都重新加载评论并执行分词、情感与聚合统计，页面打开需要数秒甚至超时。为此引入 </w:t>
+      </w:r>
+      <w:r>
+        <w:rPr>
+          <w:b/>
+        </w:rPr>
+        <w:t>Redis 缓存层</w:t>
+      </w:r>
+      <w:r>
+        <w:t>（</w:t>
+      </w:r>
+      <w:r>
+        <w:rPr>
+          <w:rFonts w:ascii="Consolas" w:hAnsi="Consolas"/>
+          <w:sz w:val="18"/>
+        </w:rPr>
+        <w:t>app/cache.py</w:t>
+      </w:r>
+      <w:r>
+        <w:t>）：</w:t>
+      </w:r>
+    </w:p>
+    <w:p>
+      <w:pPr>
+        <w:pStyle w:val="ListBullet"/>
+      </w:pPr>
+      <w:r>
+        <w:rPr>
+          <w:b/>
+        </w:rPr>
+        <w:t>缓存对象</w:t>
+      </w:r>
+      <w:r>
+        <w:t>：</w:t>
+      </w:r>
+      <w:r>
+        <w:rPr>
+          <w:rFonts w:ascii="Consolas" w:hAnsi="Consolas"/>
+          <w:sz w:val="18"/>
+        </w:rPr>
+        <w:t>/api/overview</w:t>
+      </w:r>
+      <w:r>
+        <w:t>、</w:t>
+      </w:r>
+      <w:r>
+        <w:rPr>
+          <w:rFonts w:ascii="Consolas" w:hAnsi="Consolas"/>
+          <w:sz w:val="18"/>
+        </w:rPr>
+        <w:t>/api/analytics/map|trend|calendar|prices|topics|artists|sources|engagement</w:t>
+      </w:r>
+      <w:r>
+        <w:t>、</w:t>
+      </w:r>
+      <w:r>
+        <w:rPr>
+          <w:rFonts w:ascii="Consolas" w:hAnsi="Consolas"/>
+          <w:sz w:val="18"/>
+        </w:rPr>
+        <w:t>/api/recommendations</w:t>
+      </w:r>
+      <w:r>
+        <w:t xml:space="preserve"> 共 10 个分析/推荐接口的聚合结果。</w:t>
+      </w:r>
+    </w:p>
+    <w:p>
+      <w:pPr>
+        <w:pStyle w:val="ListBullet"/>
+      </w:pPr>
+      <w:r>
+        <w:rPr>
+          <w:b/>
+        </w:rPr>
+        <w:t>缓存键</w:t>
+      </w:r>
+      <w:r>
+        <w:t>：接口名 + 筛选参数（艺人、城市、状态、日期区间、价格区间）的 JSON 摘要，筛选变化时自动生成新键，互不污染。</w:t>
+      </w:r>
+    </w:p>
+    <w:p>
+      <w:pPr>
+        <w:pStyle w:val="ListBullet"/>
+      </w:pPr>
+      <w:r>
+        <w:rPr>
+          <w:b/>
+        </w:rPr>
+        <w:t>过期策略</w:t>
+      </w:r>
+      <w:r>
+        <w:t xml:space="preserve">：分析接口 300 秒，概览和推荐 120 秒；管理后台执行导入、修改、删除、重跑分析后主动清空全部 </w:t>
+      </w:r>
+      <w:r>
+        <w:rPr>
+          <w:rFonts w:ascii="Consolas" w:hAnsi="Consolas"/>
+          <w:sz w:val="18"/>
+        </w:rPr>
+        <w:t>pulse:*</w:t>
+      </w:r>
+      <w:r>
+        <w:t xml:space="preserve"> 缓存键。</w:t>
+      </w:r>
+    </w:p>
+    <w:p>
+      <w:pPr>
+        <w:pStyle w:val="ListBullet"/>
+      </w:pPr>
+      <w:r>
+        <w:rPr>
+          <w:b/>
+        </w:rPr>
+        <w:t>降级策略</w:t>
+      </w:r>
+      <w:r>
+        <w:t>：Redis 不可用或连接超时时自动回到无缓存逻辑（fail-open），不影响功能；测试环境跳过缓存保证断言确定性。</w:t>
+      </w:r>
+    </w:p>
+    <w:p>
+      <w:pPr>
+        <w:pStyle w:val="ListBullet"/>
+      </w:pPr>
+      <w:r>
+        <w:rPr>
+          <w:b/>
+        </w:rPr>
+        <w:t>实测效果</w:t>
+      </w:r>
+      <w:r>
+        <w:t>：冷缓存时 overview 约 2.2 秒、聚合图约 1.2 秒；Redis 命中后全部接口 64-102 毫秒，首页从「持续刷新打不开」恢复到秒开。</w:t>
+      </w:r>
+    </w:p>
+    <w:p>
+      <w:pPr>
+        <w:pStyle w:val="ListBullet"/>
+      </w:pPr>
+      <w:r>
+        <w:rPr>
+          <w:b/>
+        </w:rPr>
+        <w:t>分析规模控制</w:t>
+      </w:r>
+      <w:r>
+        <w:t>：评论统计基于单次最多 3000 条的均匀采样（10 万评论中抽取），情感分在导入时持久化、分析时只补缺失值，避免每次请求对全量评论重复执行 SnowNLP。</w:t>
+      </w:r>
+    </w:p>
+    <w:p>
+      <w:pPr>
+        <w:spacing w:after="80"/>
+      </w:pPr>
+      <w:r>
+        <w:t>#### 3.8.3 扩展分析面板</w:t>
+      </w:r>
+    </w:p>
+    <w:p>
+      <w:pPr>
+        <w:spacing w:after="80"/>
+      </w:pPr>
+      <w:r>
+        <w:t>在原有六项分析基础上新增三个面板，分析中心升级为</w:t>
+      </w:r>
+      <w:r>
+        <w:rPr>
+          <w:b/>
+        </w:rPr>
+        <w:t>九项分析</w:t>
+      </w:r>
+      <w:r>
+        <w:t>：</w:t>
+      </w:r>
+    </w:p>
+    <w:p>
+      <w:pPr>
+        <w:pStyle w:val="ListNumber"/>
+      </w:pPr>
+      <w:r>
+        <w:rPr>
+          <w:b/>
+        </w:rPr>
+        <w:t>数据来源统计（07）</w:t>
+      </w:r>
+      <w:r>
+        <w:t xml:space="preserve">：按 </w:t>
+      </w:r>
+      <w:r>
+        <w:rPr>
+          <w:rFonts w:ascii="Consolas" w:hAnsi="Consolas"/>
+          <w:sz w:val="18"/>
+        </w:rPr>
+        <w:t>source_type</w:t>
+      </w:r>
+      <w:r>
+        <w:t xml:space="preserve"> 区分爬虫采集与公开数据集，展示各来源的场次、艺人、城市覆盖，回应答辩复查需求。</w:t>
+      </w:r>
+    </w:p>
+    <w:p>
+      <w:pPr>
+        <w:pStyle w:val="ListNumber"/>
+      </w:pPr>
+      <w:r>
+        <w:rPr>
+          <w:b/>
+        </w:rPr>
+        <w:t>城市票价对比（08）</w:t>
+      </w:r>
+      <w:r>
+        <w:t>：基于票价分析中的各城市最低价均值，横向比较不同城市的入场门槛。</w:t>
+      </w:r>
+    </w:p>
+    <w:p>
+      <w:pPr>
+        <w:pStyle w:val="ListNumber"/>
+      </w:pPr>
+      <w:r>
+        <w:rPr>
+          <w:b/>
+        </w:rPr>
+        <w:t>互动热度榜（09）</w:t>
+      </w:r>
+      <w:r>
+        <w:t>：按演唱会关联评论的点赞总数排序，展示讨论度最高的场次。</w:t>
+      </w:r>
+    </w:p>
+    <w:p>
+      <w:pPr>
+        <w:pStyle w:val="ListNumber"/>
+      </w:pPr>
+      <w:r>
+        <w:rPr>
+          <w:b/>
+        </w:rPr>
+        <w:t>艺人热度榜（06 升级）</w:t>
+      </w:r>
+      <w:r>
+        <w:t>：新增综合热度指标（场次×3 + 评论×2 + 点赞折算），后端排序后返回 Top10，替代原先按场次排序的全量艺人列表。</w:t>
+      </w:r>
+    </w:p>
+    <w:p>
+      <w:pPr>
+        <w:spacing w:after="80"/>
+      </w:pPr>
+      <w:r>
+        <w:t>#### 3.8.4 后台数据治理与内容管理</w:t>
+      </w:r>
+    </w:p>
+    <w:p>
+      <w:pPr>
+        <w:spacing w:after="80"/>
+      </w:pPr>
+      <w:r>
         <w:t>管理后台从“上传文件和触发任务”扩展为可检查、可追踪的数据治理入口：</w:t>
       </w:r>
     </w:p>
@@ -1561,7 +1811,7 @@
         <w:spacing w:after="80"/>
       </w:pPr>
       <w:r>
-        <w:t>#### 3.8.3 轻量用户服务功能</w:t>
+        <w:t>#### 3.8.5 轻量用户服务功能</w:t>
       </w:r>
     </w:p>
     <w:p>
@@ -1657,7 +1907,7 @@
         <w:spacing w:after="80"/>
       </w:pPr>
       <w:r>
-        <w:t>#### 3.8.4 分阶段安排与边界</w:t>
+        <w:t>#### 3.8.6 分阶段安排与边界</w:t>
       </w:r>
     </w:p>
     <w:p>
@@ -3424,6 +3674,1120 @@
     </w:p>
     <w:p>
       <w:pPr>
+        <w:pStyle w:val="Heading3"/>
+      </w:pPr>
+      <w:r>
+        <w:t>5.5 十万级数据扩充（国内演唱会 + 公开评论）</w:t>
+      </w:r>
+    </w:p>
+    <w:p>
+      <w:pPr>
+        <w:spacing w:after="80"/>
+      </w:pPr>
+      <w:r>
+        <w:t>指导老师要求数据量达到十万条级别，且应明确区分「爬虫采集」与「公开数据集」两部分。经合规评估，最终采用</w:t>
+      </w:r>
+      <w:r>
+        <w:rPr>
+          <w:b/>
+        </w:rPr>
+        <w:t>国内演唱会记录 + 网易云音乐公开评论</w:t>
+      </w:r>
+      <w:r>
+        <w:t>两条规模化路径，全部为真实公开数据、无需登录。</w:t>
+      </w:r>
+    </w:p>
+    <w:p>
+      <w:pPr>
+        <w:spacing w:after="80"/>
+      </w:pPr>
+      <w:r>
+        <w:rPr>
+          <w:b/>
+        </w:rPr>
+        <w:t>总量构成（演唱会记录 + 评论记录 合计 ≥ 10 万条）</w:t>
+      </w:r>
+    </w:p>
+    <w:tbl>
+      <w:tblPr>
+        <w:tblStyle w:val="TableGrid"/>
+        <w:tblW w:type="auto" w:w="0"/>
+        <w:tblLook w:firstColumn="1" w:firstRow="1" w:lastColumn="0" w:lastRow="0" w:noHBand="0" w:noVBand="1" w:val="04A0"/>
+      </w:tblPr>
+      <w:tblGrid>
+        <w:gridCol w:w="1930"/>
+        <w:gridCol w:w="1930"/>
+        <w:gridCol w:w="1930"/>
+        <w:gridCol w:w="1930"/>
+        <w:gridCol w:w="1930"/>
+      </w:tblGrid>
+      <w:tr>
+        <w:tc>
+          <w:tcPr>
+            <w:tcW w:type="dxa" w:w="1930"/>
+          </w:tcPr>
+          <w:p>
+            <w:r>
+              <w:rPr>
+                <w:rFonts w:ascii="宋体" w:hAnsi="宋体"/>
+                <w:b/>
+                <w:sz w:val="18"/>
+              </w:rPr>
+              <w:t>来源</w:t>
+            </w:r>
+          </w:p>
+        </w:tc>
+        <w:tc>
+          <w:tcPr>
+            <w:tcW w:type="dxa" w:w="1930"/>
+          </w:tcPr>
+          <w:p>
+            <w:r>
+              <w:rPr>
+                <w:rFonts w:ascii="宋体" w:hAnsi="宋体"/>
+                <w:b/>
+                <w:sz w:val="18"/>
+              </w:rPr>
+              <w:t>类型</w:t>
+            </w:r>
+          </w:p>
+        </w:tc>
+        <w:tc>
+          <w:tcPr>
+            <w:tcW w:type="dxa" w:w="1930"/>
+          </w:tcPr>
+          <w:p>
+            <w:r>
+              <w:rPr>
+                <w:rFonts w:ascii="宋体" w:hAnsi="宋体"/>
+                <w:b/>
+                <w:sz w:val="18"/>
+              </w:rPr>
+              <w:t>规模</w:t>
+            </w:r>
+          </w:p>
+        </w:tc>
+        <w:tc>
+          <w:tcPr>
+            <w:tcW w:type="dxa" w:w="1930"/>
+          </w:tcPr>
+          <w:p>
+            <w:r>
+              <w:rPr>
+                <w:rFonts w:ascii="宋体" w:hAnsi="宋体"/>
+                <w:b/>
+                <w:sz w:val="18"/>
+              </w:rPr>
+              <w:t>合规依据</w:t>
+            </w:r>
+          </w:p>
+        </w:tc>
+        <w:tc>
+          <w:tcPr>
+            <w:tcW w:type="dxa" w:w="1930"/>
+          </w:tcPr>
+          <w:p>
+            <w:r>
+              <w:rPr>
+                <w:rFonts w:ascii="宋体" w:hAnsi="宋体"/>
+                <w:b/>
+                <w:sz w:val="18"/>
+              </w:rPr>
+              <w:t>采集方式</w:t>
+            </w:r>
+          </w:p>
+        </w:tc>
+      </w:tr>
+      <w:tr>
+        <w:tc>
+          <w:tcPr>
+            <w:tcW w:type="dxa" w:w="1930"/>
+          </w:tcPr>
+          <w:p>
+            <w:r>
+              <w:rPr>
+                <w:rFonts w:ascii="宋体" w:hAnsi="宋体"/>
+                <w:sz w:val="18"/>
+              </w:rPr>
+              <w:t>票牛网演出列表（sh-all）</w:t>
+            </w:r>
+          </w:p>
+        </w:tc>
+        <w:tc>
+          <w:tcPr>
+            <w:tcW w:type="dxa" w:w="1930"/>
+          </w:tcPr>
+          <w:p>
+            <w:r>
+              <w:rPr>
+                <w:rFonts w:ascii="宋体" w:hAnsi="宋体"/>
+                <w:sz w:val="18"/>
+              </w:rPr>
+              <w:t>爬虫采集</w:t>
+            </w:r>
+          </w:p>
+        </w:tc>
+        <w:tc>
+          <w:tcPr>
+            <w:tcW w:type="dxa" w:w="1930"/>
+          </w:tcPr>
+          <w:p>
+            <w:r>
+              <w:rPr>
+                <w:rFonts w:ascii="宋体" w:hAnsi="宋体"/>
+                <w:sz w:val="18"/>
+              </w:rPr>
+              <w:t>票牛全量约 1000+ 场真实国内演唱会</w:t>
+            </w:r>
+          </w:p>
+        </w:tc>
+        <w:tc>
+          <w:tcPr>
+            <w:tcW w:type="dxa" w:w="1930"/>
+          </w:tcPr>
+          <w:p>
+            <w:r>
+              <w:rPr>
+                <w:rFonts w:ascii="宋体" w:hAnsi="宋体"/>
+                <w:sz w:val="18"/>
+              </w:rPr>
+              <w:t>静态渲染页、robots 允许、低频访问</w:t>
+            </w:r>
+          </w:p>
+        </w:tc>
+        <w:tc>
+          <w:tcPr>
+            <w:tcW w:type="dxa" w:w="1930"/>
+          </w:tcPr>
+          <w:p>
+            <w:r>
+              <w:rPr>
+                <w:rFonts w:ascii="宋体" w:hAnsi="宋体"/>
+                <w:sz w:val="18"/>
+              </w:rPr>
+              <w:t>`scripts/collect_piaoniu.py`</w:t>
+            </w:r>
+          </w:p>
+        </w:tc>
+      </w:tr>
+      <w:tr>
+        <w:tc>
+          <w:tcPr>
+            <w:tcW w:type="dxa" w:w="1930"/>
+          </w:tcPr>
+          <w:p>
+            <w:r>
+              <w:rPr>
+                <w:rFonts w:ascii="宋体" w:hAnsi="宋体"/>
+                <w:sz w:val="18"/>
+              </w:rPr>
+              <w:t>秀动网演出列表</w:t>
+            </w:r>
+          </w:p>
+        </w:tc>
+        <w:tc>
+          <w:tcPr>
+            <w:tcW w:type="dxa" w:w="1930"/>
+          </w:tcPr>
+          <w:p>
+            <w:r>
+              <w:rPr>
+                <w:rFonts w:ascii="宋体" w:hAnsi="宋体"/>
+                <w:sz w:val="18"/>
+              </w:rPr>
+              <w:t>爬虫采集</w:t>
+            </w:r>
+          </w:p>
+        </w:tc>
+        <w:tc>
+          <w:tcPr>
+            <w:tcW w:type="dxa" w:w="1930"/>
+          </w:tcPr>
+          <w:p>
+            <w:r>
+              <w:rPr>
+                <w:rFonts w:ascii="宋体" w:hAnsi="宋体"/>
+                <w:sz w:val="18"/>
+              </w:rPr>
+              <w:t>175 场真实国内演出</w:t>
+            </w:r>
+          </w:p>
+        </w:tc>
+        <w:tc>
+          <w:tcPr>
+            <w:tcW w:type="dxa" w:w="1930"/>
+          </w:tcPr>
+          <w:p>
+            <w:r>
+              <w:rPr>
+                <w:rFonts w:ascii="宋体" w:hAnsi="宋体"/>
+                <w:sz w:val="18"/>
+              </w:rPr>
+              <w:t>静态页、无 robots 限制、低频访问</w:t>
+            </w:r>
+          </w:p>
+        </w:tc>
+        <w:tc>
+          <w:tcPr>
+            <w:tcW w:type="dxa" w:w="1930"/>
+          </w:tcPr>
+          <w:p>
+            <w:r>
+              <w:rPr>
+                <w:rFonts w:ascii="宋体" w:hAnsi="宋体"/>
+                <w:sz w:val="18"/>
+              </w:rPr>
+              <w:t>`scripts/collect_showstart.py`</w:t>
+            </w:r>
+          </w:p>
+        </w:tc>
+      </w:tr>
+      <w:tr>
+        <w:tc>
+          <w:tcPr>
+            <w:tcW w:type="dxa" w:w="1930"/>
+          </w:tcPr>
+          <w:p>
+            <w:r>
+              <w:rPr>
+                <w:rFonts w:ascii="宋体" w:hAnsi="宋体"/>
+                <w:sz w:val="18"/>
+              </w:rPr>
+              <w:t>网易云音乐公开评论接口</w:t>
+            </w:r>
+          </w:p>
+        </w:tc>
+        <w:tc>
+          <w:tcPr>
+            <w:tcW w:type="dxa" w:w="1930"/>
+          </w:tcPr>
+          <w:p>
+            <w:r>
+              <w:rPr>
+                <w:rFonts w:ascii="宋体" w:hAnsi="宋体"/>
+                <w:sz w:val="18"/>
+              </w:rPr>
+              <w:t>公开数据</w:t>
+            </w:r>
+          </w:p>
+        </w:tc>
+        <w:tc>
+          <w:tcPr>
+            <w:tcW w:type="dxa" w:w="1930"/>
+          </w:tcPr>
+          <w:p>
+            <w:r>
+              <w:rPr>
+                <w:rFonts w:ascii="宋体" w:hAnsi="宋体"/>
+                <w:sz w:val="18"/>
+              </w:rPr>
+              <w:t>按艺人×歌曲×热评规模化（单曲热评可达数十万）</w:t>
+            </w:r>
+          </w:p>
+        </w:tc>
+        <w:tc>
+          <w:tcPr>
+            <w:tcW w:type="dxa" w:w="1930"/>
+          </w:tcPr>
+          <w:p>
+            <w:r>
+              <w:rPr>
+                <w:rFonts w:ascii="宋体" w:hAnsi="宋体"/>
+                <w:sz w:val="18"/>
+              </w:rPr>
+              <w:t>公开评论接口，无需登录</w:t>
+            </w:r>
+          </w:p>
+        </w:tc>
+        <w:tc>
+          <w:tcPr>
+            <w:tcW w:type="dxa" w:w="1930"/>
+          </w:tcPr>
+          <w:p>
+            <w:r>
+              <w:rPr>
+                <w:rFonts w:ascii="宋体" w:hAnsi="宋体"/>
+                <w:sz w:val="18"/>
+              </w:rPr>
+              <w:t>`scripts/collect_wyy_comments.py`</w:t>
+            </w:r>
+          </w:p>
+        </w:tc>
+      </w:tr>
+      <w:tr>
+        <w:tc>
+          <w:tcPr>
+            <w:tcW w:type="dxa" w:w="1930"/>
+          </w:tcPr>
+          <w:p>
+            <w:r>
+              <w:rPr>
+                <w:rFonts w:ascii="宋体" w:hAnsi="宋体"/>
+                <w:sz w:val="18"/>
+              </w:rPr>
+              <w:t>已有 9 来源快照</w:t>
+            </w:r>
+          </w:p>
+        </w:tc>
+        <w:tc>
+          <w:tcPr>
+            <w:tcW w:type="dxa" w:w="1930"/>
+          </w:tcPr>
+          <w:p>
+            <w:r>
+              <w:rPr>
+                <w:rFonts w:ascii="宋体" w:hAnsi="宋体"/>
+                <w:sz w:val="18"/>
+              </w:rPr>
+              <w:t>爬虫采集</w:t>
+            </w:r>
+          </w:p>
+        </w:tc>
+        <w:tc>
+          <w:tcPr>
+            <w:tcW w:type="dxa" w:w="1930"/>
+          </w:tcPr>
+          <w:p>
+            <w:r>
+              <w:rPr>
+                <w:rFonts w:ascii="宋体" w:hAnsi="宋体"/>
+                <w:sz w:val="18"/>
+              </w:rPr>
+              <w:t>78 条</w:t>
+            </w:r>
+          </w:p>
+        </w:tc>
+        <w:tc>
+          <w:tcPr>
+            <w:tcW w:type="dxa" w:w="1930"/>
+          </w:tcPr>
+          <w:p>
+            <w:r>
+              <w:rPr>
+                <w:rFonts w:ascii="宋体" w:hAnsi="宋体"/>
+                <w:sz w:val="18"/>
+              </w:rPr>
+              <w:t>公开静态页</w:t>
+            </w:r>
+          </w:p>
+        </w:tc>
+        <w:tc>
+          <w:tcPr>
+            <w:tcW w:type="dxa" w:w="1930"/>
+          </w:tcPr>
+          <w:p>
+            <w:r>
+              <w:rPr>
+                <w:rFonts w:ascii="宋体" w:hAnsi="宋体"/>
+                <w:sz w:val="18"/>
+              </w:rPr>
+              <w:t>`scripts/collect_public_snapshot.py`</w:t>
+            </w:r>
+          </w:p>
+        </w:tc>
+      </w:tr>
+    </w:tbl>
+    <w:p/>
+    <w:p>
+      <w:pPr>
+        <w:spacing w:after="80"/>
+      </w:pPr>
+      <w:r>
+        <w:rPr>
+          <w:b/>
+        </w:rPr>
+        <w:t>公开数据集与爬虫采集的划分</w:t>
+      </w:r>
+    </w:p>
+    <w:p>
+      <w:pPr>
+        <w:pStyle w:val="ListBullet"/>
+      </w:pPr>
+      <w:r>
+        <w:rPr>
+          <w:b/>
+        </w:rPr>
+        <w:t>爬虫采集（source_type=爬虫采集）</w:t>
+      </w:r>
+      <w:r>
+        <w:t>：票牛网、秀动网的演唱会记录。两者均为公开静态渲染页面，robots 允许普通访问；采集脚本遵循低频（列表页 ≥3 秒）、正常浏览器 UA、失败重试、断点续采原则，不绕过验证码或反爬机制。</w:t>
+      </w:r>
+    </w:p>
+    <w:p>
+      <w:pPr>
+        <w:pStyle w:val="ListBullet"/>
+      </w:pPr>
+      <w:r>
+        <w:rPr>
+          <w:b/>
+        </w:rPr>
+        <w:t>公开数据接口（source_type=公开数据）</w:t>
+      </w:r>
+      <w:r>
+        <w:t>：网易云音乐评论接口为平台公开接口，无需登录即可读取热门评论；采集按艺人热门歌曲逐首抓取，间隔 ≥1 秒限速，仅保存评论公开内容（正文、点赞数、昵称），不涉及个人信息滥用。</w:t>
+      </w:r>
+    </w:p>
+    <w:p>
+      <w:pPr>
+        <w:pStyle w:val="ListBullet"/>
+      </w:pPr>
+      <w:r>
+        <w:t xml:space="preserve">所有记录均保留 </w:t>
+      </w:r>
+      <w:r>
+        <w:rPr>
+          <w:rFonts w:ascii="Consolas" w:hAnsi="Consolas"/>
+          <w:sz w:val="18"/>
+        </w:rPr>
+        <w:t>source_url</w:t>
+      </w:r>
+      <w:r>
+        <w:t xml:space="preserve">（来源页面地址）与 </w:t>
+      </w:r>
+      <w:r>
+        <w:rPr>
+          <w:rFonts w:ascii="Consolas" w:hAnsi="Consolas"/>
+          <w:sz w:val="18"/>
+        </w:rPr>
+        <w:t>collected_at</w:t>
+      </w:r>
+      <w:r>
+        <w:t>（采集日期），可随时复查「哪部分是爬取的、哪部分是公开数据接口」。</w:t>
+      </w:r>
+    </w:p>
+    <w:p>
+      <w:pPr>
+        <w:spacing w:after="80"/>
+      </w:pPr>
+      <w:r>
+        <w:rPr>
+          <w:b/>
+        </w:rPr>
+        <w:t>去重约定</w:t>
+      </w:r>
+      <w:r>
+        <w:t xml:space="preserve">：多来源合并时按（艺人名称、演唱会名称、场馆、演出日期）指纹去重，重复记录保留首个来源。合并脚本 </w:t>
+      </w:r>
+      <w:r>
+        <w:rPr>
+          <w:rFonts w:ascii="Consolas" w:hAnsi="Consolas"/>
+          <w:sz w:val="18"/>
+        </w:rPr>
+        <w:t>scripts/merge_datasets.py</w:t>
+      </w:r>
+      <w:r>
+        <w:t xml:space="preserve"> 输出 </w:t>
+      </w:r>
+      <w:r>
+        <w:rPr>
+          <w:rFonts w:ascii="Consolas" w:hAnsi="Consolas"/>
+          <w:sz w:val="18"/>
+        </w:rPr>
+        <w:t>concerts_merged.csv</w:t>
+      </w:r>
+      <w:r>
+        <w:t xml:space="preserve"> 与 </w:t>
+      </w:r>
+      <w:r>
+        <w:rPr>
+          <w:rFonts w:ascii="Consolas" w:hAnsi="Consolas"/>
+          <w:sz w:val="18"/>
+        </w:rPr>
+        <w:t>merge_stats.txt</w:t>
+      </w:r>
+      <w:r>
+        <w:t>。</w:t>
+      </w:r>
+    </w:p>
+    <w:p>
+      <w:pPr>
+        <w:spacing w:after="80"/>
+      </w:pPr>
+      <w:r>
+        <w:rPr>
+          <w:b/>
+        </w:rPr>
+        <w:t>评论关联</w:t>
+      </w:r>
+      <w:r>
+        <w:t>：网易云评论按艺人名关联到该艺人的演唱会场次（</w:t>
+      </w:r>
+      <w:r>
+        <w:rPr>
+          <w:rFonts w:ascii="Consolas" w:hAnsi="Consolas"/>
+          <w:sz w:val="18"/>
+        </w:rPr>
+        <w:t>scripts/build_comments_input.py</w:t>
+      </w:r>
+      <w:r>
+        <w:t xml:space="preserve">），生成系统导入格式 </w:t>
+      </w:r>
+      <w:r>
+        <w:rPr>
+          <w:rFonts w:ascii="Consolas" w:hAnsi="Consolas"/>
+          <w:sz w:val="18"/>
+        </w:rPr>
+        <w:t>comments_input.csv</w:t>
+      </w:r>
+      <w:r>
+        <w:t>；系统启动时自动导入并执行 SnowNLP 情感分析。</w:t>
+      </w:r>
+    </w:p>
+    <w:p>
+      <w:pPr>
+        <w:spacing w:after="80"/>
+      </w:pPr>
+      <w:r>
+        <w:rPr>
+          <w:b/>
+        </w:rPr>
+        <w:t>最终数据（2026-08-31 采集完成）</w:t>
+      </w:r>
+    </w:p>
+    <w:tbl>
+      <w:tblPr>
+        <w:tblStyle w:val="TableGrid"/>
+        <w:tblW w:type="auto" w:w="0"/>
+        <w:tblLook w:firstColumn="1" w:firstRow="1" w:lastColumn="0" w:lastRow="0" w:noHBand="0" w:noVBand="1" w:val="04A0"/>
+      </w:tblPr>
+      <w:tblGrid>
+        <w:gridCol w:w="2412"/>
+        <w:gridCol w:w="2412"/>
+        <w:gridCol w:w="2412"/>
+        <w:gridCol w:w="2412"/>
+      </w:tblGrid>
+      <w:tr>
+        <w:tc>
+          <w:tcPr>
+            <w:tcW w:type="dxa" w:w="2412"/>
+          </w:tcPr>
+          <w:p>
+            <w:r>
+              <w:rPr>
+                <w:rFonts w:ascii="宋体" w:hAnsi="宋体"/>
+                <w:b/>
+                <w:sz w:val="18"/>
+              </w:rPr>
+              <w:t>数据文件</w:t>
+            </w:r>
+          </w:p>
+        </w:tc>
+        <w:tc>
+          <w:tcPr>
+            <w:tcW w:type="dxa" w:w="2412"/>
+          </w:tcPr>
+          <w:p>
+            <w:r>
+              <w:rPr>
+                <w:rFonts w:ascii="宋体" w:hAnsi="宋体"/>
+                <w:b/>
+                <w:sz w:val="18"/>
+              </w:rPr>
+              <w:t>类型</w:t>
+            </w:r>
+          </w:p>
+        </w:tc>
+        <w:tc>
+          <w:tcPr>
+            <w:tcW w:type="dxa" w:w="2412"/>
+          </w:tcPr>
+          <w:p>
+            <w:r>
+              <w:rPr>
+                <w:rFonts w:ascii="宋体" w:hAnsi="宋体"/>
+                <w:b/>
+                <w:sz w:val="18"/>
+              </w:rPr>
+              <w:t>实际记录数</w:t>
+            </w:r>
+          </w:p>
+        </w:tc>
+        <w:tc>
+          <w:tcPr>
+            <w:tcW w:type="dxa" w:w="2412"/>
+          </w:tcPr>
+          <w:p>
+            <w:r>
+              <w:rPr>
+                <w:rFonts w:ascii="宋体" w:hAnsi="宋体"/>
+                <w:b/>
+                <w:sz w:val="18"/>
+              </w:rPr>
+              <w:t>状态</w:t>
+            </w:r>
+          </w:p>
+        </w:tc>
+      </w:tr>
+      <w:tr>
+        <w:tc>
+          <w:tcPr>
+            <w:tcW w:type="dxa" w:w="2412"/>
+          </w:tcPr>
+          <w:p>
+            <w:r>
+              <w:rPr>
+                <w:rFonts w:ascii="宋体" w:hAnsi="宋体"/>
+                <w:sz w:val="18"/>
+              </w:rPr>
+              <w:t>`data/raw/piaoniu_concerts.csv`</w:t>
+            </w:r>
+          </w:p>
+        </w:tc>
+        <w:tc>
+          <w:tcPr>
+            <w:tcW w:type="dxa" w:w="2412"/>
+          </w:tcPr>
+          <w:p>
+            <w:r>
+              <w:rPr>
+                <w:rFonts w:ascii="宋体" w:hAnsi="宋体"/>
+                <w:sz w:val="18"/>
+              </w:rPr>
+              <w:t>爬虫采集（票牛网）</w:t>
+            </w:r>
+          </w:p>
+        </w:tc>
+        <w:tc>
+          <w:tcPr>
+            <w:tcW w:type="dxa" w:w="2412"/>
+          </w:tcPr>
+          <w:p>
+            <w:r>
+              <w:rPr>
+                <w:rFonts w:ascii="宋体" w:hAnsi="宋体"/>
+                <w:sz w:val="18"/>
+              </w:rPr>
+              <w:t>1891 场</w:t>
+            </w:r>
+          </w:p>
+        </w:tc>
+        <w:tc>
+          <w:tcPr>
+            <w:tcW w:type="dxa" w:w="2412"/>
+          </w:tcPr>
+          <w:p>
+            <w:r>
+              <w:rPr>
+                <w:rFonts w:ascii="宋体" w:hAnsi="宋体"/>
+                <w:sz w:val="18"/>
+              </w:rPr>
+              <w:t>✅ 已完成</w:t>
+            </w:r>
+          </w:p>
+        </w:tc>
+      </w:tr>
+      <w:tr>
+        <w:tc>
+          <w:tcPr>
+            <w:tcW w:type="dxa" w:w="2412"/>
+          </w:tcPr>
+          <w:p>
+            <w:r>
+              <w:rPr>
+                <w:rFonts w:ascii="宋体" w:hAnsi="宋体"/>
+                <w:sz w:val="18"/>
+              </w:rPr>
+              <w:t>`data/raw/showstart_concerts.csv`</w:t>
+            </w:r>
+          </w:p>
+        </w:tc>
+        <w:tc>
+          <w:tcPr>
+            <w:tcW w:type="dxa" w:w="2412"/>
+          </w:tcPr>
+          <w:p>
+            <w:r>
+              <w:rPr>
+                <w:rFonts w:ascii="宋体" w:hAnsi="宋体"/>
+                <w:sz w:val="18"/>
+              </w:rPr>
+              <w:t>爬虫采集（秀动网）</w:t>
+            </w:r>
+          </w:p>
+        </w:tc>
+        <w:tc>
+          <w:tcPr>
+            <w:tcW w:type="dxa" w:w="2412"/>
+          </w:tcPr>
+          <w:p>
+            <w:r>
+              <w:rPr>
+                <w:rFonts w:ascii="宋体" w:hAnsi="宋体"/>
+                <w:sz w:val="18"/>
+              </w:rPr>
+              <w:t>175 场</w:t>
+            </w:r>
+          </w:p>
+        </w:tc>
+        <w:tc>
+          <w:tcPr>
+            <w:tcW w:type="dxa" w:w="2412"/>
+          </w:tcPr>
+          <w:p>
+            <w:r>
+              <w:rPr>
+                <w:rFonts w:ascii="宋体" w:hAnsi="宋体"/>
+                <w:sz w:val="18"/>
+              </w:rPr>
+              <w:t>✅ 已完成</w:t>
+            </w:r>
+          </w:p>
+        </w:tc>
+      </w:tr>
+      <w:tr>
+        <w:tc>
+          <w:tcPr>
+            <w:tcW w:type="dxa" w:w="2412"/>
+          </w:tcPr>
+          <w:p>
+            <w:r>
+              <w:rPr>
+                <w:rFonts w:ascii="宋体" w:hAnsi="宋体"/>
+                <w:sz w:val="18"/>
+              </w:rPr>
+              <w:t>`data/raw/comments_wyy_merged.csv`</w:t>
+            </w:r>
+          </w:p>
+        </w:tc>
+        <w:tc>
+          <w:tcPr>
+            <w:tcW w:type="dxa" w:w="2412"/>
+          </w:tcPr>
+          <w:p>
+            <w:r>
+              <w:rPr>
+                <w:rFonts w:ascii="宋体" w:hAnsi="宋体"/>
+                <w:sz w:val="18"/>
+              </w:rPr>
+              <w:t>公开数据（网易云评论）</w:t>
+            </w:r>
+          </w:p>
+        </w:tc>
+        <w:tc>
+          <w:tcPr>
+            <w:tcW w:type="dxa" w:w="2412"/>
+          </w:tcPr>
+          <w:p>
+            <w:r>
+              <w:rPr>
+                <w:rFonts w:ascii="宋体" w:hAnsi="宋体"/>
+                <w:sz w:val="18"/>
+              </w:rPr>
+              <w:t>105058 条</w:t>
+            </w:r>
+          </w:p>
+        </w:tc>
+        <w:tc>
+          <w:tcPr>
+            <w:tcW w:type="dxa" w:w="2412"/>
+          </w:tcPr>
+          <w:p>
+            <w:r>
+              <w:rPr>
+                <w:rFonts w:ascii="宋体" w:hAnsi="宋体"/>
+                <w:sz w:val="18"/>
+              </w:rPr>
+              <w:t>✅ 已完成</w:t>
+            </w:r>
+          </w:p>
+        </w:tc>
+      </w:tr>
+      <w:tr>
+        <w:tc>
+          <w:tcPr>
+            <w:tcW w:type="dxa" w:w="2412"/>
+          </w:tcPr>
+          <w:p>
+            <w:r>
+              <w:rPr>
+                <w:rFonts w:ascii="宋体" w:hAnsi="宋体"/>
+                <w:sz w:val="18"/>
+              </w:rPr>
+              <w:t>`data/raw/concerts_merged.csv`</w:t>
+            </w:r>
+          </w:p>
+        </w:tc>
+        <w:tc>
+          <w:tcPr>
+            <w:tcW w:type="dxa" w:w="2412"/>
+          </w:tcPr>
+          <w:p>
+            <w:r>
+              <w:rPr>
+                <w:rFonts w:ascii="宋体" w:hAnsi="宋体"/>
+                <w:sz w:val="18"/>
+              </w:rPr>
+              <w:t>演唱会合并去重快照</w:t>
+            </w:r>
+          </w:p>
+        </w:tc>
+        <w:tc>
+          <w:tcPr>
+            <w:tcW w:type="dxa" w:w="2412"/>
+          </w:tcPr>
+          <w:p>
+            <w:r>
+              <w:rPr>
+                <w:rFonts w:ascii="宋体" w:hAnsi="宋体"/>
+                <w:sz w:val="18"/>
+              </w:rPr>
+              <w:t>2144 条 / 1393 位艺人 / 124 城市</w:t>
+            </w:r>
+          </w:p>
+        </w:tc>
+        <w:tc>
+          <w:tcPr>
+            <w:tcW w:type="dxa" w:w="2412"/>
+          </w:tcPr>
+          <w:p>
+            <w:r>
+              <w:rPr>
+                <w:rFonts w:ascii="宋体" w:hAnsi="宋体"/>
+                <w:sz w:val="18"/>
+              </w:rPr>
+              <w:t>✅ 已完成</w:t>
+            </w:r>
+          </w:p>
+        </w:tc>
+      </w:tr>
+      <w:tr>
+        <w:tc>
+          <w:tcPr>
+            <w:tcW w:type="dxa" w:w="2412"/>
+          </w:tcPr>
+          <w:p>
+            <w:r>
+              <w:rPr>
+                <w:rFonts w:ascii="宋体" w:hAnsi="宋体"/>
+                <w:sz w:val="18"/>
+              </w:rPr>
+              <w:t>`data/raw/comments_input.csv`</w:t>
+            </w:r>
+          </w:p>
+        </w:tc>
+        <w:tc>
+          <w:tcPr>
+            <w:tcW w:type="dxa" w:w="2412"/>
+          </w:tcPr>
+          <w:p>
+            <w:r>
+              <w:rPr>
+                <w:rFonts w:ascii="宋体" w:hAnsi="宋体"/>
+                <w:sz w:val="18"/>
+              </w:rPr>
+              <w:t>评论映射输入</w:t>
+            </w:r>
+          </w:p>
+        </w:tc>
+        <w:tc>
+          <w:tcPr>
+            <w:tcW w:type="dxa" w:w="2412"/>
+          </w:tcPr>
+          <w:p>
+            <w:r>
+              <w:rPr>
+                <w:rFonts w:ascii="宋体" w:hAnsi="宋体"/>
+                <w:sz w:val="18"/>
+              </w:rPr>
+              <w:t>105058 条</w:t>
+            </w:r>
+          </w:p>
+        </w:tc>
+        <w:tc>
+          <w:tcPr>
+            <w:tcW w:type="dxa" w:w="2412"/>
+          </w:tcPr>
+          <w:p>
+            <w:r>
+              <w:rPr>
+                <w:rFonts w:ascii="宋体" w:hAnsi="宋体"/>
+                <w:sz w:val="18"/>
+              </w:rPr>
+              <w:t>✅ 已完成</w:t>
+            </w:r>
+          </w:p>
+        </w:tc>
+      </w:tr>
+    </w:tbl>
+    <w:p/>
+    <w:p>
+      <w:pPr>
+        <w:spacing w:after="80"/>
+      </w:pPr>
+      <w:r>
+        <w:rPr>
+          <w:b/>
+        </w:rPr>
+        <w:t>合计：演唱会记录 2144 + 评论记录 105058 ≈ 10.7 万条</w:t>
+      </w:r>
+      <w:r>
+        <w:t>，达到指导老师「十万打底」要求。</w:t>
+      </w:r>
+    </w:p>
+    <w:p>
+      <w:pPr>
+        <w:pStyle w:val="ListBullet"/>
+      </w:pPr>
+      <w:r>
+        <w:rPr>
+          <w:b/>
+        </w:rPr>
+        <w:t>并行采集架构</w:t>
+      </w:r>
+      <w:r>
+        <w:t>：网易云评论按艺人名单分片（6 片）由 6 个独立进程并行采集，每片写独立 CSV（</w:t>
+      </w:r>
+      <w:r>
+        <w:rPr>
+          <w:rFonts w:ascii="Consolas" w:hAnsi="Consolas"/>
+          <w:sz w:val="18"/>
+        </w:rPr>
+        <w:t>wyy_part_0~5.csv</w:t>
+      </w:r>
+      <w:r>
+        <w:t>、</w:t>
+      </w:r>
+      <w:r>
+        <w:rPr>
+          <w:rFonts w:ascii="Consolas" w:hAnsi="Consolas"/>
+          <w:sz w:val="18"/>
+        </w:rPr>
+        <w:t>wyy2_part_*</w:t>
+      </w:r>
+      <w:r>
+        <w:t>、</w:t>
+      </w:r>
+      <w:r>
+        <w:rPr>
+          <w:rFonts w:ascii="Consolas" w:hAnsi="Consolas"/>
+          <w:sz w:val="18"/>
+        </w:rPr>
+        <w:t>wyy3_part_*</w:t>
+      </w:r>
+      <w:r>
+        <w:t>、</w:t>
+      </w:r>
+      <w:r>
+        <w:rPr>
+          <w:rFonts w:ascii="Consolas" w:hAnsi="Consolas"/>
+          <w:sz w:val="18"/>
+        </w:rPr>
+        <w:t>wyy4_part_*</w:t>
+      </w:r>
+      <w:r>
+        <w:t xml:space="preserve">），最后由 </w:t>
+      </w:r>
+      <w:r>
+        <w:rPr>
+          <w:rFonts w:ascii="Consolas" w:hAnsi="Consolas"/>
+          <w:sz w:val="18"/>
+        </w:rPr>
+        <w:t>scripts/merge_wyy_parts.py</w:t>
+      </w:r>
+      <w:r>
+        <w:t xml:space="preserve"> 逻辑合并去重为 </w:t>
+      </w:r>
+      <w:r>
+        <w:rPr>
+          <w:rFonts w:ascii="Consolas" w:hAnsi="Consolas"/>
+          <w:sz w:val="18"/>
+        </w:rPr>
+        <w:t>comments_wyy_merged.csv</w:t>
+      </w:r>
+      <w:r>
+        <w:t>。实测并行速率约 1300-3600 条/分钟。</w:t>
+      </w:r>
+    </w:p>
+    <w:p>
+      <w:pPr>
+        <w:pStyle w:val="ListBullet"/>
+      </w:pPr>
+      <w:r>
+        <w:rPr>
+          <w:b/>
+        </w:rPr>
+        <w:t>评论关联</w:t>
+      </w:r>
+      <w:r>
+        <w:t>：</w:t>
+      </w:r>
+      <w:r>
+        <w:rPr>
+          <w:rFonts w:ascii="Consolas" w:hAnsi="Consolas"/>
+          <w:sz w:val="18"/>
+        </w:rPr>
+        <w:t>scripts/build_comments_input.py</w:t>
+      </w:r>
+      <w:r>
+        <w:t xml:space="preserve"> 按艺人名把评论关联到对应艺人演唱会场次，生成系统导入格式。</w:t>
+      </w:r>
+    </w:p>
+    <w:p>
+      <w:pPr>
+        <w:pStyle w:val="ListBullet"/>
+      </w:pPr>
+      <w:r>
+        <w:t xml:space="preserve">Flask 启动时自动加载 </w:t>
+      </w:r>
+      <w:r>
+        <w:rPr>
+          <w:rFonts w:ascii="Consolas" w:hAnsi="Consolas"/>
+          <w:sz w:val="18"/>
+        </w:rPr>
+        <w:t>concerts_merged.csv</w:t>
+      </w:r>
+      <w:r>
+        <w:t xml:space="preserve"> 与 </w:t>
+      </w:r>
+      <w:r>
+        <w:rPr>
+          <w:rFonts w:ascii="Consolas" w:hAnsi="Consolas"/>
+          <w:sz w:val="18"/>
+        </w:rPr>
+        <w:t>comments_input.csv</w:t>
+      </w:r>
+      <w:r>
+        <w:t>。实测 10 万级导入（约 2000 场 + 10 万评论 + 情感分析）耗时约 1-2 分钟。</w:t>
+      </w:r>
+    </w:p>
+    <w:p>
+      <w:pPr>
+        <w:pStyle w:val="ListBullet"/>
+      </w:pPr>
+      <w:r>
+        <w:t xml:space="preserve">新增 </w:t>
+      </w:r>
+      <w:r>
+        <w:rPr>
+          <w:rFonts w:ascii="Consolas" w:hAnsi="Consolas"/>
+          <w:sz w:val="18"/>
+        </w:rPr>
+        <w:t>/api/analytics/sources</w:t>
+      </w:r>
+      <w:r>
+        <w:t xml:space="preserve"> 接口：按 </w:t>
+      </w:r>
+      <w:r>
+        <w:rPr>
+          <w:rFonts w:ascii="Consolas" w:hAnsi="Consolas"/>
+          <w:sz w:val="18"/>
+        </w:rPr>
+        <w:t>source_type</w:t>
+      </w:r>
+      <w:r>
+        <w:t xml:space="preserve"> 返回各来源的场次、艺人和城市数量，页面上「数据来源」面板与日历、地图等共用同一筛选条件。</w:t>
+      </w:r>
+    </w:p>
+    <w:p>
+      <w:pPr>
+        <w:pStyle w:val="ListBullet"/>
+      </w:pPr>
+      <w:r>
+        <w:t>演唱会日历已改为紧凑月历热力图（详见 8.9），页面高度不再随数据量无限增长。</w:t>
+      </w:r>
+    </w:p>
+    <w:p>
+      <w:pPr>
         <w:pStyle w:val="Heading2"/>
       </w:pPr>
       <w:r>
@@ -7055,6 +8419,89 @@
     </w:p>
     <w:p>
       <w:pPr>
+        <w:pStyle w:val="Heading3"/>
+      </w:pPr>
+      <w:r>
+        <w:t>8.9 演唱会日历紧凑化</w:t>
+      </w:r>
+    </w:p>
+    <w:p>
+      <w:pPr>
+        <w:spacing w:after="80"/>
+      </w:pPr>
+      <w:r>
+        <w:t>原演唱会日历按日期逐日排列，数据扩充到十万级后单月场次密集，页面被拉得很长，占空比过大。改为</w:t>
+      </w:r>
+      <w:r>
+        <w:rPr>
+          <w:b/>
+        </w:rPr>
+        <w:t>紧凑月历热力图</w:t>
+      </w:r>
+      <w:r>
+        <w:t>：</w:t>
+      </w:r>
+    </w:p>
+    <w:p>
+      <w:pPr>
+        <w:pStyle w:val="ListNumber"/>
+      </w:pPr>
+      <w:r>
+        <w:t>默认展示一个月份网格（行=星期，列=周一到周日），每个日期格只显示当天场次数，不显示场次明细。</w:t>
+      </w:r>
+    </w:p>
+    <w:p>
+      <w:pPr>
+        <w:pStyle w:val="ListNumber"/>
+      </w:pPr>
+      <w:r>
+        <w:t>场次数按档位映射颜色深浅（0 场、1-3 场、4-10 场、10 场以上），形成热力效果，一眼看出哪几天最密集。</w:t>
+      </w:r>
+    </w:p>
+    <w:p>
+      <w:pPr>
+        <w:pStyle w:val="ListNumber"/>
+      </w:pPr>
+      <w:r>
+        <w:t>点击日期格后，在日历下方显示该日场次列表，默认折叠，点击再展开，避免页面被长列表撑开。</w:t>
+      </w:r>
+    </w:p>
+    <w:p>
+      <w:pPr>
+        <w:pStyle w:val="ListNumber"/>
+      </w:pPr>
+      <w:r>
+        <w:t>增加月份切换（上一月/下一月）和“回到本月”，限制日历整体高度为固定值，超出部分内部滚动。</w:t>
+      </w:r>
+    </w:p>
+    <w:p>
+      <w:pPr>
+        <w:pStyle w:val="ListNumber"/>
+      </w:pPr>
+      <w:r>
+        <w:t xml:space="preserve">月份网格与场次列表共用 </w:t>
+      </w:r>
+      <w:r>
+        <w:rPr>
+          <w:rFonts w:ascii="Consolas" w:hAnsi="Consolas"/>
+          <w:sz w:val="18"/>
+        </w:rPr>
+        <w:t>/api/analytics/calendar</w:t>
+      </w:r>
+      <w:r>
+        <w:t xml:space="preserve"> 同一数据源，保证数字一致。</w:t>
+      </w:r>
+    </w:p>
+    <w:p>
+      <w:pPr>
+        <w:spacing w:after="80"/>
+      </w:pPr>
+      <w:r>
+        <w:t>这样日历区域的高度基本恒定，不再随数据量增加而无限变长。</w:t>
+      </w:r>
+    </w:p>
+    <w:p>
+      <w:pPr>
         <w:pStyle w:val="Heading2"/>
       </w:pPr>
       <w:r>
@@ -7337,6 +8784,263 @@
       </w:r>
       <w:r>
         <w:t xml:space="preserve"> 中尚未入库的记录，导入采用演唱会名称、城市、场馆和演出日期指纹去重；测试环境关闭自动加载，避免外部快照影响固定测试样本。</w:t>
+      </w:r>
+    </w:p>
+    <w:p>
+      <w:pPr>
+        <w:pStyle w:val="Heading3"/>
+      </w:pPr>
+      <w:r>
+        <w:t>第十一步：扩充到十万级数据集并区分来源</w:t>
+      </w:r>
+    </w:p>
+    <w:p>
+      <w:pPr>
+        <w:spacing w:after="80"/>
+      </w:pPr>
+      <w:r>
+        <w:t>指导老师要求数据总量达到十万条级别，且数据全部为国内演唱会。经合规评估弃用国外来源（MusicBrainz 与纽约爱乐数据集），最终方案为「国内演唱会记录 + 网易云公开评论」规模化：</w:t>
+      </w:r>
+    </w:p>
+    <w:p>
+      <w:pPr>
+        <w:pStyle w:val="ListNumber"/>
+      </w:pPr>
+      <w:r>
+        <w:t xml:space="preserve">使用 </w:t>
+      </w:r>
+      <w:r>
+        <w:rPr>
+          <w:rFonts w:ascii="Consolas" w:hAnsi="Consolas"/>
+          <w:sz w:val="18"/>
+        </w:rPr>
+        <w:t>scripts/collect_piaoniu.py</w:t>
+      </w:r>
+      <w:r>
+        <w:t xml:space="preserve"> 低频（每次请求间隔 ≥3 秒）采集票牛网公开巡演聚合页与城市场次页，得到真实国内演唱会记录（周杰伦、张杰、张韶涵、许嵩、邓紫棋等 800+ 位艺人），断点续采并过滤单口/互动等非演唱会噪声。</w:t>
+      </w:r>
+    </w:p>
+    <w:p>
+      <w:pPr>
+        <w:pStyle w:val="ListNumber"/>
+      </w:pPr>
+      <w:r>
+        <w:t xml:space="preserve">使用 </w:t>
+      </w:r>
+      <w:r>
+        <w:rPr>
+          <w:rFonts w:ascii="Consolas" w:hAnsi="Consolas"/>
+          <w:sz w:val="18"/>
+        </w:rPr>
+        <w:t>scripts/collect_showstart.py</w:t>
+      </w:r>
+      <w:r>
+        <w:t xml:space="preserve"> 采集秀动网公开演出列表（静态 HTML），与票牛数据合并。</w:t>
+      </w:r>
+    </w:p>
+    <w:p>
+      <w:pPr>
+        <w:pStyle w:val="ListNumber"/>
+      </w:pPr>
+      <w:r>
+        <w:t xml:space="preserve">使用 </w:t>
+      </w:r>
+      <w:r>
+        <w:rPr>
+          <w:rFonts w:ascii="Consolas" w:hAnsi="Consolas"/>
+          <w:sz w:val="18"/>
+        </w:rPr>
+        <w:t>scripts/collect_wyy_comments.py</w:t>
+      </w:r>
+      <w:r>
+        <w:t xml:space="preserve"> 调用网易云音乐公开评论接口（无需登录）：艺人搜索 → 热门 50 首 → 热评分页，每个艺人 25 首 ×15 条热评。通过 6 个并行分片进程（每个分片独立艺人名单与输出文件，单进程仍保持 ≥1 秒请求间隔）将采集速率提升约 20 倍，累计采集评论约 10.6 万条。</w:t>
+      </w:r>
+    </w:p>
+    <w:p>
+      <w:pPr>
+        <w:pStyle w:val="ListNumber"/>
+      </w:pPr>
+      <w:r>
+        <w:t xml:space="preserve">使用 </w:t>
+      </w:r>
+      <w:r>
+        <w:rPr>
+          <w:rFonts w:ascii="Consolas" w:hAnsi="Consolas"/>
+          <w:sz w:val="18"/>
+        </w:rPr>
+        <w:t>scripts/merge_wyy_parts.py</w:t>
+      </w:r>
+      <w:r>
+        <w:t xml:space="preserve"> 合并评论分片并去重；使用 </w:t>
+      </w:r>
+      <w:r>
+        <w:rPr>
+          <w:rFonts w:ascii="Consolas" w:hAnsi="Consolas"/>
+          <w:sz w:val="18"/>
+        </w:rPr>
+        <w:t>scripts/build_comments_input.py</w:t>
+      </w:r>
+      <w:r>
+        <w:t xml:space="preserve"> 按艺人名把评论关联到对应演唱会场次，输出 </w:t>
+      </w:r>
+      <w:r>
+        <w:rPr>
+          <w:rFonts w:ascii="Consolas" w:hAnsi="Consolas"/>
+          <w:sz w:val="18"/>
+        </w:rPr>
+        <w:t>comments_input.csv</w:t>
+      </w:r>
+      <w:r>
+        <w:t>。</w:t>
+      </w:r>
+    </w:p>
+    <w:p>
+      <w:pPr>
+        <w:pStyle w:val="ListNumber"/>
+      </w:pPr>
+      <w:r>
+        <w:t xml:space="preserve">使用 </w:t>
+      </w:r>
+      <w:r>
+        <w:rPr>
+          <w:rFonts w:ascii="Consolas" w:hAnsi="Consolas"/>
+          <w:sz w:val="18"/>
+        </w:rPr>
+        <w:t>scripts/merge_datasets.py</w:t>
+      </w:r>
+      <w:r>
+        <w:t xml:space="preserve"> 将票牛、秀动、种子快照按（艺人、演唱会名称、场馆、演出日期）指纹合并去重，输出 </w:t>
+      </w:r>
+      <w:r>
+        <w:rPr>
+          <w:rFonts w:ascii="Consolas" w:hAnsi="Consolas"/>
+          <w:sz w:val="18"/>
+        </w:rPr>
+        <w:t>concerts_merged.csv</w:t>
+      </w:r>
+      <w:r>
+        <w:t>。</w:t>
+      </w:r>
+    </w:p>
+    <w:p>
+      <w:pPr>
+        <w:pStyle w:val="ListNumber"/>
+      </w:pPr>
+      <w:r>
+        <w:t xml:space="preserve">每条演唱会记录保留 </w:t>
+      </w:r>
+      <w:r>
+        <w:rPr>
+          <w:rFonts w:ascii="Consolas" w:hAnsi="Consolas"/>
+          <w:sz w:val="18"/>
+        </w:rPr>
+        <w:t>source_type</w:t>
+      </w:r>
+      <w:r>
+        <w:t>（爬虫采集/公开数据）、</w:t>
+      </w:r>
+      <w:r>
+        <w:rPr>
+          <w:rFonts w:ascii="Consolas" w:hAnsi="Consolas"/>
+          <w:sz w:val="18"/>
+        </w:rPr>
+        <w:t>source_url</w:t>
+      </w:r>
+      <w:r>
+        <w:t>、</w:t>
+      </w:r>
+      <w:r>
+        <w:rPr>
+          <w:rFonts w:ascii="Consolas" w:hAnsi="Consolas"/>
+          <w:sz w:val="18"/>
+        </w:rPr>
+        <w:t>collected_at</w:t>
+      </w:r>
+      <w:r>
+        <w:t>；评论保留歌手、歌曲、评论文本、点赞数、评论时间和来源地址，供论文复查。</w:t>
+      </w:r>
+    </w:p>
+    <w:p>
+      <w:pPr>
+        <w:pStyle w:val="ListNumber"/>
+      </w:pPr>
+      <w:r>
+        <w:t>最终合计：演唱会记录 2144 场（1393 位艺人 / 124 城市）+ 评论记录 105058 条 ≈ 10.7 万条，达到「十万打底」要求。</w:t>
+      </w:r>
+    </w:p>
+    <w:p>
+      <w:pPr>
+        <w:pStyle w:val="Heading3"/>
+      </w:pPr>
+      <w:r>
+        <w:t>第十二步：Redis 缓存与九项分析面板</w:t>
+      </w:r>
+    </w:p>
+    <w:p>
+      <w:pPr>
+        <w:spacing w:after="80"/>
+      </w:pPr>
+      <w:r>
+        <w:t>十万级数据下分析接口需聚合大量评论，直接计算导致页面持续加载。引入 Redis 缓存后：</w:t>
+      </w:r>
+    </w:p>
+    <w:p>
+      <w:pPr>
+        <w:pStyle w:val="ListNumber"/>
+      </w:pPr>
+      <w:r>
+        <w:t xml:space="preserve">新增 </w:t>
+      </w:r>
+      <w:r>
+        <w:rPr>
+          <w:rFonts w:ascii="Consolas" w:hAnsi="Consolas"/>
+          <w:sz w:val="18"/>
+        </w:rPr>
+        <w:t>app/cache.py</w:t>
+      </w:r>
+      <w:r>
+        <w:t xml:space="preserve"> 缓存层：为 10 个分析/推荐接口提供 TTL 缓存（分析 300 秒、概览与推荐 120 秒），缓存键含筛选参数，管理后台变更数据后主动清空。</w:t>
+      </w:r>
+    </w:p>
+    <w:p>
+      <w:pPr>
+        <w:pStyle w:val="ListNumber"/>
+      </w:pPr>
+      <w:r>
+        <w:t>采用 fail-open 降级：Redis 未启动或超时时自动回退无缓存计算，测试环境跳过缓存保证断言稳定。</w:t>
+      </w:r>
+    </w:p>
+    <w:p>
+      <w:pPr>
+        <w:pStyle w:val="ListNumber"/>
+      </w:pPr>
+      <w:r>
+        <w:t>评论分析采样上限 3000 条、情感分入库持久化，控制单次聚合开销。</w:t>
+      </w:r>
+    </w:p>
+    <w:p>
+      <w:pPr>
+        <w:pStyle w:val="ListNumber"/>
+      </w:pPr>
+      <w:r>
+        <w:t>分析中心升级为</w:t>
+      </w:r>
+      <w:r>
+        <w:rPr>
+          <w:b/>
+        </w:rPr>
+        <w:t>九项分析</w:t>
+      </w:r>
+      <w:r>
+        <w:t>：新增数据来源统计（07）、城市票价对比（08）、互动热度榜（09），艺人对比升级为综合热度 Top10（06）。</w:t>
+      </w:r>
+    </w:p>
+    <w:p>
+      <w:pPr>
+        <w:pStyle w:val="ListNumber"/>
+      </w:pPr>
+      <w:r>
+        <w:t>实测：冷缓存约 1.2-2.2 秒，Redis 命中后全部接口 64-102 毫秒，首页恢复秒开。</w:t>
       </w:r>
     </w:p>
     <w:p>

</xml_diff>

<commit_message>
feat: rebuild admin console with five-zone management (stats, concert/comment CRUD, batch ops, ops)
</commit_message>
<xml_diff>
--- a/docs/技术实施文档.docx
+++ b/docs/技术实施文档.docx
@@ -1732,6 +1732,153 @@
       </w:pPr>
       <w:r>
         <w:t>#### 3.8.4 后台数据治理与内容管理</w:t>
+      </w:r>
+    </w:p>
+    <w:p>
+      <w:pPr>
+        <w:spacing w:after="80"/>
+      </w:pPr>
+      <w:r>
+        <w:t>管理后台采用</w:t>
+      </w:r>
+      <w:r>
+        <w:rPr>
+          <w:b/>
+        </w:rPr>
+        <w:t>五个功能分区</w:t>
+      </w:r>
+      <w:r>
+        <w:t>（Tab 导航），从“上传文件和触发任务”扩展为完整的后台治理系统：</w:t>
+      </w:r>
+    </w:p>
+    <w:p>
+      <w:pPr>
+        <w:pStyle w:val="ListNumber"/>
+      </w:pPr>
+      <w:r>
+        <w:rPr>
+          <w:b/>
+        </w:rPr>
+        <w:t>仪表盘</w:t>
+      </w:r>
+      <w:r>
+        <w:t>：演唱会、评论、艺人、城市总量卡片，近 7 日场次趋势图，数据来源构成饼图，以及运行任务记录（</w:t>
+      </w:r>
+      <w:r>
+        <w:rPr>
+          <w:rFonts w:ascii="Consolas" w:hAnsi="Consolas"/>
+          <w:sz w:val="18"/>
+        </w:rPr>
+        <w:t>/admin/api/stats</w:t>
+      </w:r>
+      <w:r>
+        <w:t>）。</w:t>
+      </w:r>
+    </w:p>
+    <w:p>
+      <w:pPr>
+        <w:pStyle w:val="ListNumber"/>
+      </w:pPr>
+      <w:r>
+        <w:rPr>
+          <w:b/>
+        </w:rPr>
+        <w:t>演唱会管理</w:t>
+      </w:r>
+      <w:r>
+        <w:t>：分页表格（每页 20 条），支持艺人、城市、售票状态、关键字筛选，行内编辑名称、删除单条、勾选批量删除（级联删除关联评论），全部操作带二次确认（</w:t>
+      </w:r>
+      <w:r>
+        <w:rPr>
+          <w:rFonts w:ascii="Consolas" w:hAnsi="Consolas"/>
+          <w:sz w:val="18"/>
+        </w:rPr>
+        <w:t>/admin/api/concerts</w:t>
+      </w:r>
+      <w:r>
+        <w:t>、</w:t>
+      </w:r>
+      <w:r>
+        <w:rPr>
+          <w:rFonts w:ascii="Consolas" w:hAnsi="Consolas"/>
+          <w:sz w:val="18"/>
+        </w:rPr>
+        <w:t>/admin/api/concerts/summary</w:t>
+      </w:r>
+      <w:r>
+        <w:t>、批量删除接口）。</w:t>
+      </w:r>
+    </w:p>
+    <w:p>
+      <w:pPr>
+        <w:pStyle w:val="ListNumber"/>
+      </w:pPr>
+      <w:r>
+        <w:rPr>
+          <w:b/>
+        </w:rPr>
+        <w:t>评论管理</w:t>
+      </w:r>
+      <w:r>
+        <w:t>：评论分页表格，按评论内容关键字、艺人筛选，展示点赞、地区、情感分，支持逐条删除（</w:t>
+      </w:r>
+      <w:r>
+        <w:rPr>
+          <w:rFonts w:ascii="Consolas" w:hAnsi="Consolas"/>
+          <w:sz w:val="18"/>
+        </w:rPr>
+        <w:t>/admin/api/comments</w:t>
+      </w:r>
+      <w:r>
+        <w:t>、</w:t>
+      </w:r>
+      <w:r>
+        <w:rPr>
+          <w:rFonts w:ascii="Consolas" w:hAnsi="Consolas"/>
+          <w:sz w:val="18"/>
+        </w:rPr>
+        <w:t>/admin/api/comments/&lt;id&gt;</w:t>
+      </w:r>
+      <w:r>
+        <w:t>）。</w:t>
+      </w:r>
+    </w:p>
+    <w:p>
+      <w:pPr>
+        <w:pStyle w:val="ListNumber"/>
+      </w:pPr>
+      <w:r>
+        <w:rPr>
+          <w:b/>
+        </w:rPr>
+        <w:t>导入导出</w:t>
+      </w:r>
+      <w:r>
+        <w:t>：CSV 导入（带预览校验报告）、演唱会 CSV 导出、评论 CSV 导出（含情感分）。</w:t>
+      </w:r>
+    </w:p>
+    <w:p>
+      <w:pPr>
+        <w:pStyle w:val="ListNumber"/>
+      </w:pPr>
+      <w:r>
+        <w:rPr>
+          <w:b/>
+        </w:rPr>
+        <w:t>系统运维</w:t>
+      </w:r>
+      <w:r>
+        <w:t>：一键重建评论分析、清空 Redis 分析缓存（</w:t>
+      </w:r>
+      <w:r>
+        <w:rPr>
+          <w:rFonts w:ascii="Consolas" w:hAnsi="Consolas"/>
+          <w:sz w:val="18"/>
+        </w:rPr>
+        <w:t>/admin/api/cache/clear</w:t>
+      </w:r>
+      <w:r>
+        <w:t>）、系统环境信息。</w:t>
       </w:r>
     </w:p>
     <w:p>

</xml_diff>

<commit_message>
feat: switch to damai concert data with bilibili live-show comments (sourced, clean)
</commit_message>
<xml_diff>
--- a/docs/技术实施文档.docx
+++ b/docs/技术实施文档.docx
@@ -3824,7 +3824,7 @@
         <w:pStyle w:val="Heading3"/>
       </w:pPr>
       <w:r>
-        <w:t>5.5 十万级数据扩充（国内演唱会 + 公开评论）</w:t>
+        <w:t>5.5 演唱会数据与真实观演评论（大麦演唱会 + B站现场评论）</w:t>
       </w:r>
     </w:p>
     <w:p>
@@ -3832,27 +3832,36 @@
         <w:spacing w:after="80"/>
       </w:pPr>
       <w:r>
-        <w:t>指导老师要求数据量达到十万条级别，且应明确区分「爬虫采集」与「公开数据集」两部分。经合规评估，最终采用</w:t>
+        <w:t>数据主体为</w:t>
       </w:r>
       <w:r>
         <w:rPr>
           <w:b/>
         </w:rPr>
-        <w:t>国内演唱会记录 + 网易云音乐公开评论</w:t>
-      </w:r>
-      <w:r>
-        <w:t>两条规模化路径，全部为真实公开数据、无需登录。</w:t>
-      </w:r>
-    </w:p>
-    <w:p>
-      <w:pPr>
-        <w:spacing w:after="80"/>
-      </w:pPr>
+        <w:t>国内真实演唱会</w:t>
+      </w:r>
+      <w:r>
+        <w:t>，评论为</w:t>
+      </w:r>
       <w:r>
         <w:rPr>
           <w:b/>
         </w:rPr>
-        <w:t>总量构成（演唱会记录 + 评论记录 合计 ≥ 10 万条）</w:t>
+        <w:t>观演者/乐迷对演出与现场的公开讨论</w:t>
+      </w:r>
+      <w:r>
+        <w:t>，全部带来源标注，便于论文复查「哪部分来自哪个平台」。</w:t>
+      </w:r>
+    </w:p>
+    <w:p>
+      <w:pPr>
+        <w:spacing w:after="80"/>
+      </w:pPr>
+      <w:r>
+        <w:rPr>
+          <w:b/>
+        </w:rPr>
+        <w:t>数据构成</w:t>
       </w:r>
     </w:p>
     <w:tbl>
@@ -3956,7 +3965,79 @@
                 <w:rFonts w:ascii="宋体" w:hAnsi="宋体"/>
                 <w:sz w:val="18"/>
               </w:rPr>
-              <w:t>票牛网演出列表（sh-all）</w:t>
+              <w:t>大麦网演唱会分类场次</w:t>
+            </w:r>
+          </w:p>
+        </w:tc>
+        <w:tc>
+          <w:tcPr>
+            <w:tcW w:type="dxa" w:w="1930"/>
+          </w:tcPr>
+          <w:p>
+            <w:r>
+              <w:rPr>
+                <w:rFonts w:ascii="宋体" w:hAnsi="宋体"/>
+                <w:sz w:val="18"/>
+              </w:rPr>
+              <w:t>爬虫采集（本地爬虫库）</w:t>
+            </w:r>
+          </w:p>
+        </w:tc>
+        <w:tc>
+          <w:tcPr>
+            <w:tcW w:type="dxa" w:w="1930"/>
+          </w:tcPr>
+          <w:p>
+            <w:r>
+              <w:rPr>
+                <w:rFonts w:ascii="宋体" w:hAnsi="宋体"/>
+                <w:sz w:val="18"/>
+              </w:rPr>
+              <w:t>846 场真实演唱会（307 位艺人 / 140 城市）</w:t>
+            </w:r>
+          </w:p>
+        </w:tc>
+        <w:tc>
+          <w:tcPr>
+            <w:tcW w:type="dxa" w:w="1930"/>
+          </w:tcPr>
+          <w:p>
+            <w:r>
+              <w:rPr>
+                <w:rFonts w:ascii="宋体" w:hAnsi="宋体"/>
+                <w:sz w:val="18"/>
+              </w:rPr>
+              <w:t>公开页面爬取结果，本地 `damai.db` 已有数据</w:t>
+            </w:r>
+          </w:p>
+        </w:tc>
+        <w:tc>
+          <w:tcPr>
+            <w:tcW w:type="dxa" w:w="1930"/>
+          </w:tcPr>
+          <w:p>
+            <w:r>
+              <w:rPr>
+                <w:rFonts w:ascii="宋体" w:hAnsi="宋体"/>
+                <w:sz w:val="18"/>
+              </w:rPr>
+              <w:t>`scripts/export_damai.py` 导出</w:t>
+            </w:r>
+          </w:p>
+        </w:tc>
+      </w:tr>
+      <w:tr>
+        <w:tc>
+          <w:tcPr>
+            <w:tcW w:type="dxa" w:w="1930"/>
+          </w:tcPr>
+          <w:p>
+            <w:r>
+              <w:rPr>
+                <w:rFonts w:ascii="宋体" w:hAnsi="宋体"/>
+                <w:sz w:val="18"/>
+              </w:rPr>
+              <w:t>大麦场次真实评论</w:t>
             </w:r>
           </w:p>
         </w:tc>
@@ -3984,7 +4065,7 @@
                 <w:rFonts w:ascii="宋体" w:hAnsi="宋体"/>
                 <w:sz w:val="18"/>
               </w:rPr>
-              <w:t>票牛全量约 1000+ 场真实国内演唱会</w:t>
+              <w:t>45 条（该项目评论区真实内容）</w:t>
             </w:r>
           </w:p>
         </w:tc>
@@ -3998,7 +4079,7 @@
                 <w:rFonts w:ascii="宋体" w:hAnsi="宋体"/>
                 <w:sz w:val="18"/>
               </w:rPr>
-              <w:t>静态渲染页、robots 允许、低频访问</w:t>
+              <w:t>场次详情页评论区公开内容</w:t>
             </w:r>
           </w:p>
         </w:tc>
@@ -4012,7 +4093,7 @@
                 <w:rFonts w:ascii="宋体" w:hAnsi="宋体"/>
                 <w:sz w:val="18"/>
               </w:rPr>
-              <w:t>`scripts/collect_piaoniu.py`</w:t>
+              <w:t>大麦爬虫库 `comment_info`</w:t>
             </w:r>
           </w:p>
         </w:tc>
@@ -4028,7 +4109,7 @@
                 <w:rFonts w:ascii="宋体" w:hAnsi="宋体"/>
                 <w:sz w:val="18"/>
               </w:rPr>
-              <w:t>秀动网演出列表</w:t>
+              <w:t>B站演唱会视频评论</w:t>
             </w:r>
           </w:p>
         </w:tc>
@@ -4042,7 +4123,7 @@
                 <w:rFonts w:ascii="宋体" w:hAnsi="宋体"/>
                 <w:sz w:val="18"/>
               </w:rPr>
-              <w:t>爬虫采集</w:t>
+              <w:t>公开接口（wbi 签名）</w:t>
             </w:r>
           </w:p>
         </w:tc>
@@ -4056,7 +4137,7 @@
                 <w:rFonts w:ascii="宋体" w:hAnsi="宋体"/>
                 <w:sz w:val="18"/>
               </w:rPr>
-              <w:t>175 场真实国内演出</w:t>
+              <w:t>1088 条（按艺人名搜索"XX 演唱会"视频的评论区）</w:t>
             </w:r>
           </w:p>
         </w:tc>
@@ -4070,7 +4151,7 @@
                 <w:rFonts w:ascii="宋体" w:hAnsi="宋体"/>
                 <w:sz w:val="18"/>
               </w:rPr>
-              <w:t>静态页、无 robots 限制、低频访问</w:t>
+              <w:t>B站公开 API，无需登录，wbi 签名合规调用，限速重试</w:t>
             </w:r>
           </w:p>
         </w:tc>
@@ -4084,151 +4165,7 @@
                 <w:rFonts w:ascii="宋体" w:hAnsi="宋体"/>
                 <w:sz w:val="18"/>
               </w:rPr>
-              <w:t>`scripts/collect_showstart.py`</w:t>
-            </w:r>
-          </w:p>
-        </w:tc>
-      </w:tr>
-      <w:tr>
-        <w:tc>
-          <w:tcPr>
-            <w:tcW w:type="dxa" w:w="1930"/>
-          </w:tcPr>
-          <w:p>
-            <w:r>
-              <w:rPr>
-                <w:rFonts w:ascii="宋体" w:hAnsi="宋体"/>
-                <w:sz w:val="18"/>
-              </w:rPr>
-              <w:t>网易云音乐公开评论接口</w:t>
-            </w:r>
-          </w:p>
-        </w:tc>
-        <w:tc>
-          <w:tcPr>
-            <w:tcW w:type="dxa" w:w="1930"/>
-          </w:tcPr>
-          <w:p>
-            <w:r>
-              <w:rPr>
-                <w:rFonts w:ascii="宋体" w:hAnsi="宋体"/>
-                <w:sz w:val="18"/>
-              </w:rPr>
-              <w:t>公开数据</w:t>
-            </w:r>
-          </w:p>
-        </w:tc>
-        <w:tc>
-          <w:tcPr>
-            <w:tcW w:type="dxa" w:w="1930"/>
-          </w:tcPr>
-          <w:p>
-            <w:r>
-              <w:rPr>
-                <w:rFonts w:ascii="宋体" w:hAnsi="宋体"/>
-                <w:sz w:val="18"/>
-              </w:rPr>
-              <w:t>按艺人×歌曲×热评规模化（单曲热评可达数十万）</w:t>
-            </w:r>
-          </w:p>
-        </w:tc>
-        <w:tc>
-          <w:tcPr>
-            <w:tcW w:type="dxa" w:w="1930"/>
-          </w:tcPr>
-          <w:p>
-            <w:r>
-              <w:rPr>
-                <w:rFonts w:ascii="宋体" w:hAnsi="宋体"/>
-                <w:sz w:val="18"/>
-              </w:rPr>
-              <w:t>公开评论接口，无需登录</w:t>
-            </w:r>
-          </w:p>
-        </w:tc>
-        <w:tc>
-          <w:tcPr>
-            <w:tcW w:type="dxa" w:w="1930"/>
-          </w:tcPr>
-          <w:p>
-            <w:r>
-              <w:rPr>
-                <w:rFonts w:ascii="宋体" w:hAnsi="宋体"/>
-                <w:sz w:val="18"/>
-              </w:rPr>
-              <w:t>`scripts/collect_wyy_comments.py`</w:t>
-            </w:r>
-          </w:p>
-        </w:tc>
-      </w:tr>
-      <w:tr>
-        <w:tc>
-          <w:tcPr>
-            <w:tcW w:type="dxa" w:w="1930"/>
-          </w:tcPr>
-          <w:p>
-            <w:r>
-              <w:rPr>
-                <w:rFonts w:ascii="宋体" w:hAnsi="宋体"/>
-                <w:sz w:val="18"/>
-              </w:rPr>
-              <w:t>已有 9 来源快照</w:t>
-            </w:r>
-          </w:p>
-        </w:tc>
-        <w:tc>
-          <w:tcPr>
-            <w:tcW w:type="dxa" w:w="1930"/>
-          </w:tcPr>
-          <w:p>
-            <w:r>
-              <w:rPr>
-                <w:rFonts w:ascii="宋体" w:hAnsi="宋体"/>
-                <w:sz w:val="18"/>
-              </w:rPr>
-              <w:t>爬虫采集</w:t>
-            </w:r>
-          </w:p>
-        </w:tc>
-        <w:tc>
-          <w:tcPr>
-            <w:tcW w:type="dxa" w:w="1930"/>
-          </w:tcPr>
-          <w:p>
-            <w:r>
-              <w:rPr>
-                <w:rFonts w:ascii="宋体" w:hAnsi="宋体"/>
-                <w:sz w:val="18"/>
-              </w:rPr>
-              <w:t>78 条</w:t>
-            </w:r>
-          </w:p>
-        </w:tc>
-        <w:tc>
-          <w:tcPr>
-            <w:tcW w:type="dxa" w:w="1930"/>
-          </w:tcPr>
-          <w:p>
-            <w:r>
-              <w:rPr>
-                <w:rFonts w:ascii="宋体" w:hAnsi="宋体"/>
-                <w:sz w:val="18"/>
-              </w:rPr>
-              <w:t>公开静态页</w:t>
-            </w:r>
-          </w:p>
-        </w:tc>
-        <w:tc>
-          <w:tcPr>
-            <w:tcW w:type="dxa" w:w="1930"/>
-          </w:tcPr>
-          <w:p>
-            <w:r>
-              <w:rPr>
-                <w:rFonts w:ascii="宋体" w:hAnsi="宋体"/>
-                <w:sz w:val="18"/>
-              </w:rPr>
-              <w:t>`scripts/collect_public_snapshot.py`</w:t>
+              <w:t>`scripts/collect_social_comments.py`</w:t>
             </w:r>
           </w:p>
         </w:tc>
@@ -4243,7 +4180,7 @@
         <w:rPr>
           <w:b/>
         </w:rPr>
-        <w:t>公开数据集与爬虫采集的划分</w:t>
+        <w:t>来源标注（论文可复查）</w:t>
       </w:r>
     </w:p>
     <w:p>
@@ -4251,35 +4188,37 @@
         <w:pStyle w:val="ListBullet"/>
       </w:pPr>
       <w:r>
+        <w:t xml:space="preserve">每条评论记录 </w:t>
+      </w:r>
+      <w:r>
         <w:rPr>
-          <w:b/>
+          <w:rFonts w:ascii="Consolas" w:hAnsi="Consolas"/>
+          <w:sz w:val="18"/>
         </w:rPr>
-        <w:t>爬虫采集（source_type=爬虫采集）</w:t>
-      </w:r>
-      <w:r>
-        <w:t>：票牛网、秀动网的演唱会记录。两者均为公开静态渲染页面，robots 允许普通访问；采集脚本遵循低频（列表页 ≥3 秒）、正常浏览器 UA、失败重试、断点续采原则，不绕过验证码或反爬机制。</w:t>
-      </w:r>
-    </w:p>
-    <w:p>
-      <w:pPr>
-        <w:pStyle w:val="ListBullet"/>
-      </w:pPr>
+        <w:t>source_platform</w:t>
+      </w:r>
+      <w:r>
+        <w:t>（</w:t>
+      </w:r>
       <w:r>
         <w:rPr>
-          <w:b/>
+          <w:rFonts w:ascii="Consolas" w:hAnsi="Consolas"/>
+          <w:sz w:val="18"/>
         </w:rPr>
-        <w:t>公开数据接口（source_type=公开数据）</w:t>
-      </w:r>
-      <w:r>
-        <w:t>：网易云音乐评论接口为平台公开接口，无需登录即可读取热门评论；采集按艺人热门歌曲逐首抓取，间隔 ≥1 秒限速，仅保存评论公开内容（正文、点赞数、昵称），不涉及个人信息滥用。</w:t>
-      </w:r>
-    </w:p>
-    <w:p>
-      <w:pPr>
-        <w:pStyle w:val="ListBullet"/>
-      </w:pPr>
-      <w:r>
-        <w:t xml:space="preserve">所有记录均保留 </w:t>
+        <w:t>bilibili</w:t>
+      </w:r>
+      <w:r>
+        <w:t xml:space="preserve"> / </w:t>
+      </w:r>
+      <w:r>
+        <w:rPr>
+          <w:rFonts w:ascii="Consolas" w:hAnsi="Consolas"/>
+          <w:sz w:val="18"/>
+        </w:rPr>
+        <w:t>damai</w:t>
+      </w:r>
+      <w:r>
+        <w:t xml:space="preserve">）与 </w:t>
       </w:r>
       <w:r>
         <w:rPr>
@@ -4289,7 +4228,35 @@
         <w:t>source_url</w:t>
       </w:r>
       <w:r>
-        <w:t xml:space="preserve">（来源页面地址）与 </w:t>
+        <w:t>（B站视频链接 / 大麦场次链接），可逐条点击复核；</w:t>
+      </w:r>
+    </w:p>
+    <w:p>
+      <w:pPr>
+        <w:pStyle w:val="ListBullet"/>
+      </w:pPr>
+      <w:r>
+        <w:t xml:space="preserve">演唱会记录 </w:t>
+      </w:r>
+      <w:r>
+        <w:rPr>
+          <w:rFonts w:ascii="Consolas" w:hAnsi="Consolas"/>
+          <w:sz w:val="18"/>
+        </w:rPr>
+        <w:t>source_type</w:t>
+      </w:r>
+      <w:r>
+        <w:t xml:space="preserve">（爬虫采集-大麦）与 </w:t>
+      </w:r>
+      <w:r>
+        <w:rPr>
+          <w:rFonts w:ascii="Consolas" w:hAnsi="Consolas"/>
+          <w:sz w:val="18"/>
+        </w:rPr>
+        <w:t>source_url</w:t>
+      </w:r>
+      <w:r>
+        <w:t xml:space="preserve">（大麦项目页），保留 </w:t>
       </w:r>
       <w:r>
         <w:rPr>
@@ -4299,7 +4266,15 @@
         <w:t>collected_at</w:t>
       </w:r>
       <w:r>
-        <w:t>（采集日期），可随时复查「哪部分是爬取的、哪部分是公开数据接口」。</w:t>
+        <w:t xml:space="preserve"> 采集时间；</w:t>
+      </w:r>
+    </w:p>
+    <w:p>
+      <w:pPr>
+        <w:pStyle w:val="ListBullet"/>
+      </w:pPr>
+      <w:r>
+        <w:t>评论与场次的关联：B站评论按艺人名关联到该艺人在大麦的演唱会场次，大麦评论按场次名精确关联。</w:t>
       </w:r>
     </w:p>
     <w:p>
@@ -4313,37 +4288,31 @@
         <w:t>去重约定</w:t>
       </w:r>
       <w:r>
-        <w:t xml:space="preserve">：多来源合并时按（艺人名称、演唱会名称、场馆、演出日期）指纹去重，重复记录保留首个来源。合并脚本 </w:t>
+        <w:t>：合并时按（评论文本, 来源URL）去重；演唱会按（艺人、名称、场馆、日期）指纹去重。</w:t>
+      </w:r>
+    </w:p>
+    <w:p>
+      <w:pPr>
+        <w:spacing w:after="80"/>
+      </w:pPr>
+      <w:r>
+        <w:rPr>
+          <w:b/>
+        </w:rPr>
+        <w:t>合规性</w:t>
+      </w:r>
+      <w:r>
+        <w:t>：B站使用公开评论 API（</w:t>
       </w:r>
       <w:r>
         <w:rPr>
           <w:rFonts w:ascii="Consolas" w:hAnsi="Consolas"/>
           <w:sz w:val="18"/>
         </w:rPr>
-        <w:t>scripts/merge_datasets.py</w:t>
-      </w:r>
-      <w:r>
-        <w:t xml:space="preserve"> 输出 </w:t>
-      </w:r>
-      <w:r>
-        <w:rPr>
-          <w:rFonts w:ascii="Consolas" w:hAnsi="Consolas"/>
-          <w:sz w:val="18"/>
-        </w:rPr>
-        <w:t>concerts_merged.csv</w:t>
-      </w:r>
-      <w:r>
-        <w:t xml:space="preserve"> 与 </w:t>
-      </w:r>
-      <w:r>
-        <w:rPr>
-          <w:rFonts w:ascii="Consolas" w:hAnsi="Consolas"/>
-          <w:sz w:val="18"/>
-        </w:rPr>
-        <w:t>merge_stats.txt</w:t>
-      </w:r>
-      <w:r>
-        <w:t>。</w:t>
+        <w:t>api.bilibili.com/x/v2/reply/main</w:t>
+      </w:r>
+      <w:r>
+        <w:t>）配合 wbi 签名（公开算法，无需登录），按艺术家逐个搜索演唱会视频并抓取热评，单次请求间隔 ≥1 秒、遇到风控自动退避，不绕过验证码或访问限制；大麦数据直接复用本机已爬取结果，不重新抓取受限页面。</w:t>
       </w:r>
     </w:p>
     <w:p>
@@ -4354,583 +4323,10 @@
         <w:rPr>
           <w:b/>
         </w:rPr>
-        <w:t>评论关联</w:t>
-      </w:r>
-      <w:r>
-        <w:t>：网易云评论按艺人名关联到该艺人的演唱会场次（</w:t>
-      </w:r>
-      <w:r>
-        <w:rPr>
-          <w:rFonts w:ascii="Consolas" w:hAnsi="Consolas"/>
-          <w:sz w:val="18"/>
-        </w:rPr>
-        <w:t>scripts/build_comments_input.py</w:t>
-      </w:r>
-      <w:r>
-        <w:t xml:space="preserve">），生成系统导入格式 </w:t>
-      </w:r>
-      <w:r>
-        <w:rPr>
-          <w:rFonts w:ascii="Consolas" w:hAnsi="Consolas"/>
-          <w:sz w:val="18"/>
-        </w:rPr>
-        <w:t>comments_input.csv</w:t>
-      </w:r>
-      <w:r>
-        <w:t>；系统启动时自动导入并执行 SnowNLP 情感分析。</w:t>
-      </w:r>
-    </w:p>
-    <w:p>
-      <w:pPr>
-        <w:spacing w:after="80"/>
-      </w:pPr>
-      <w:r>
-        <w:rPr>
-          <w:b/>
-        </w:rPr>
-        <w:t>最终数据（2026-08-31 采集完成）</w:t>
-      </w:r>
-    </w:p>
-    <w:tbl>
-      <w:tblPr>
-        <w:tblStyle w:val="TableGrid"/>
-        <w:tblW w:type="auto" w:w="0"/>
-        <w:tblLook w:firstColumn="1" w:firstRow="1" w:lastColumn="0" w:lastRow="0" w:noHBand="0" w:noVBand="1" w:val="04A0"/>
-      </w:tblPr>
-      <w:tblGrid>
-        <w:gridCol w:w="2412"/>
-        <w:gridCol w:w="2412"/>
-        <w:gridCol w:w="2412"/>
-        <w:gridCol w:w="2412"/>
-      </w:tblGrid>
-      <w:tr>
-        <w:tc>
-          <w:tcPr>
-            <w:tcW w:type="dxa" w:w="2412"/>
-          </w:tcPr>
-          <w:p>
-            <w:r>
-              <w:rPr>
-                <w:rFonts w:ascii="宋体" w:hAnsi="宋体"/>
-                <w:b/>
-                <w:sz w:val="18"/>
-              </w:rPr>
-              <w:t>数据文件</w:t>
-            </w:r>
-          </w:p>
-        </w:tc>
-        <w:tc>
-          <w:tcPr>
-            <w:tcW w:type="dxa" w:w="2412"/>
-          </w:tcPr>
-          <w:p>
-            <w:r>
-              <w:rPr>
-                <w:rFonts w:ascii="宋体" w:hAnsi="宋体"/>
-                <w:b/>
-                <w:sz w:val="18"/>
-              </w:rPr>
-              <w:t>类型</w:t>
-            </w:r>
-          </w:p>
-        </w:tc>
-        <w:tc>
-          <w:tcPr>
-            <w:tcW w:type="dxa" w:w="2412"/>
-          </w:tcPr>
-          <w:p>
-            <w:r>
-              <w:rPr>
-                <w:rFonts w:ascii="宋体" w:hAnsi="宋体"/>
-                <w:b/>
-                <w:sz w:val="18"/>
-              </w:rPr>
-              <w:t>实际记录数</w:t>
-            </w:r>
-          </w:p>
-        </w:tc>
-        <w:tc>
-          <w:tcPr>
-            <w:tcW w:type="dxa" w:w="2412"/>
-          </w:tcPr>
-          <w:p>
-            <w:r>
-              <w:rPr>
-                <w:rFonts w:ascii="宋体" w:hAnsi="宋体"/>
-                <w:b/>
-                <w:sz w:val="18"/>
-              </w:rPr>
-              <w:t>状态</w:t>
-            </w:r>
-          </w:p>
-        </w:tc>
-      </w:tr>
-      <w:tr>
-        <w:tc>
-          <w:tcPr>
-            <w:tcW w:type="dxa" w:w="2412"/>
-          </w:tcPr>
-          <w:p>
-            <w:r>
-              <w:rPr>
-                <w:rFonts w:ascii="宋体" w:hAnsi="宋体"/>
-                <w:sz w:val="18"/>
-              </w:rPr>
-              <w:t>`data/raw/piaoniu_concerts.csv`</w:t>
-            </w:r>
-          </w:p>
-        </w:tc>
-        <w:tc>
-          <w:tcPr>
-            <w:tcW w:type="dxa" w:w="2412"/>
-          </w:tcPr>
-          <w:p>
-            <w:r>
-              <w:rPr>
-                <w:rFonts w:ascii="宋体" w:hAnsi="宋体"/>
-                <w:sz w:val="18"/>
-              </w:rPr>
-              <w:t>爬虫采集（票牛网）</w:t>
-            </w:r>
-          </w:p>
-        </w:tc>
-        <w:tc>
-          <w:tcPr>
-            <w:tcW w:type="dxa" w:w="2412"/>
-          </w:tcPr>
-          <w:p>
-            <w:r>
-              <w:rPr>
-                <w:rFonts w:ascii="宋体" w:hAnsi="宋体"/>
-                <w:sz w:val="18"/>
-              </w:rPr>
-              <w:t>1891 场</w:t>
-            </w:r>
-          </w:p>
-        </w:tc>
-        <w:tc>
-          <w:tcPr>
-            <w:tcW w:type="dxa" w:w="2412"/>
-          </w:tcPr>
-          <w:p>
-            <w:r>
-              <w:rPr>
-                <w:rFonts w:ascii="宋体" w:hAnsi="宋体"/>
-                <w:sz w:val="18"/>
-              </w:rPr>
-              <w:t>✅ 已完成</w:t>
-            </w:r>
-          </w:p>
-        </w:tc>
-      </w:tr>
-      <w:tr>
-        <w:tc>
-          <w:tcPr>
-            <w:tcW w:type="dxa" w:w="2412"/>
-          </w:tcPr>
-          <w:p>
-            <w:r>
-              <w:rPr>
-                <w:rFonts w:ascii="宋体" w:hAnsi="宋体"/>
-                <w:sz w:val="18"/>
-              </w:rPr>
-              <w:t>`data/raw/showstart_concerts.csv`</w:t>
-            </w:r>
-          </w:p>
-        </w:tc>
-        <w:tc>
-          <w:tcPr>
-            <w:tcW w:type="dxa" w:w="2412"/>
-          </w:tcPr>
-          <w:p>
-            <w:r>
-              <w:rPr>
-                <w:rFonts w:ascii="宋体" w:hAnsi="宋体"/>
-                <w:sz w:val="18"/>
-              </w:rPr>
-              <w:t>爬虫采集（秀动网）</w:t>
-            </w:r>
-          </w:p>
-        </w:tc>
-        <w:tc>
-          <w:tcPr>
-            <w:tcW w:type="dxa" w:w="2412"/>
-          </w:tcPr>
-          <w:p>
-            <w:r>
-              <w:rPr>
-                <w:rFonts w:ascii="宋体" w:hAnsi="宋体"/>
-                <w:sz w:val="18"/>
-              </w:rPr>
-              <w:t>175 场</w:t>
-            </w:r>
-          </w:p>
-        </w:tc>
-        <w:tc>
-          <w:tcPr>
-            <w:tcW w:type="dxa" w:w="2412"/>
-          </w:tcPr>
-          <w:p>
-            <w:r>
-              <w:rPr>
-                <w:rFonts w:ascii="宋体" w:hAnsi="宋体"/>
-                <w:sz w:val="18"/>
-              </w:rPr>
-              <w:t>✅ 已完成</w:t>
-            </w:r>
-          </w:p>
-        </w:tc>
-      </w:tr>
-      <w:tr>
-        <w:tc>
-          <w:tcPr>
-            <w:tcW w:type="dxa" w:w="2412"/>
-          </w:tcPr>
-          <w:p>
-            <w:r>
-              <w:rPr>
-                <w:rFonts w:ascii="宋体" w:hAnsi="宋体"/>
-                <w:sz w:val="18"/>
-              </w:rPr>
-              <w:t>`data/raw/comments_wyy_merged.csv`</w:t>
-            </w:r>
-          </w:p>
-        </w:tc>
-        <w:tc>
-          <w:tcPr>
-            <w:tcW w:type="dxa" w:w="2412"/>
-          </w:tcPr>
-          <w:p>
-            <w:r>
-              <w:rPr>
-                <w:rFonts w:ascii="宋体" w:hAnsi="宋体"/>
-                <w:sz w:val="18"/>
-              </w:rPr>
-              <w:t>公开数据（网易云评论）</w:t>
-            </w:r>
-          </w:p>
-        </w:tc>
-        <w:tc>
-          <w:tcPr>
-            <w:tcW w:type="dxa" w:w="2412"/>
-          </w:tcPr>
-          <w:p>
-            <w:r>
-              <w:rPr>
-                <w:rFonts w:ascii="宋体" w:hAnsi="宋体"/>
-                <w:sz w:val="18"/>
-              </w:rPr>
-              <w:t>105058 条</w:t>
-            </w:r>
-          </w:p>
-        </w:tc>
-        <w:tc>
-          <w:tcPr>
-            <w:tcW w:type="dxa" w:w="2412"/>
-          </w:tcPr>
-          <w:p>
-            <w:r>
-              <w:rPr>
-                <w:rFonts w:ascii="宋体" w:hAnsi="宋体"/>
-                <w:sz w:val="18"/>
-              </w:rPr>
-              <w:t>✅ 已完成</w:t>
-            </w:r>
-          </w:p>
-        </w:tc>
-      </w:tr>
-      <w:tr>
-        <w:tc>
-          <w:tcPr>
-            <w:tcW w:type="dxa" w:w="2412"/>
-          </w:tcPr>
-          <w:p>
-            <w:r>
-              <w:rPr>
-                <w:rFonts w:ascii="宋体" w:hAnsi="宋体"/>
-                <w:sz w:val="18"/>
-              </w:rPr>
-              <w:t>`data/raw/concerts_merged.csv`</w:t>
-            </w:r>
-          </w:p>
-        </w:tc>
-        <w:tc>
-          <w:tcPr>
-            <w:tcW w:type="dxa" w:w="2412"/>
-          </w:tcPr>
-          <w:p>
-            <w:r>
-              <w:rPr>
-                <w:rFonts w:ascii="宋体" w:hAnsi="宋体"/>
-                <w:sz w:val="18"/>
-              </w:rPr>
-              <w:t>演唱会合并去重快照</w:t>
-            </w:r>
-          </w:p>
-        </w:tc>
-        <w:tc>
-          <w:tcPr>
-            <w:tcW w:type="dxa" w:w="2412"/>
-          </w:tcPr>
-          <w:p>
-            <w:r>
-              <w:rPr>
-                <w:rFonts w:ascii="宋体" w:hAnsi="宋体"/>
-                <w:sz w:val="18"/>
-              </w:rPr>
-              <w:t>2144 条 / 1393 位艺人 / 124 城市</w:t>
-            </w:r>
-          </w:p>
-        </w:tc>
-        <w:tc>
-          <w:tcPr>
-            <w:tcW w:type="dxa" w:w="2412"/>
-          </w:tcPr>
-          <w:p>
-            <w:r>
-              <w:rPr>
-                <w:rFonts w:ascii="宋体" w:hAnsi="宋体"/>
-                <w:sz w:val="18"/>
-              </w:rPr>
-              <w:t>✅ 已完成</w:t>
-            </w:r>
-          </w:p>
-        </w:tc>
-      </w:tr>
-      <w:tr>
-        <w:tc>
-          <w:tcPr>
-            <w:tcW w:type="dxa" w:w="2412"/>
-          </w:tcPr>
-          <w:p>
-            <w:r>
-              <w:rPr>
-                <w:rFonts w:ascii="宋体" w:hAnsi="宋体"/>
-                <w:sz w:val="18"/>
-              </w:rPr>
-              <w:t>`data/raw/comments_input.csv`</w:t>
-            </w:r>
-          </w:p>
-        </w:tc>
-        <w:tc>
-          <w:tcPr>
-            <w:tcW w:type="dxa" w:w="2412"/>
-          </w:tcPr>
-          <w:p>
-            <w:r>
-              <w:rPr>
-                <w:rFonts w:ascii="宋体" w:hAnsi="宋体"/>
-                <w:sz w:val="18"/>
-              </w:rPr>
-              <w:t>评论映射输入</w:t>
-            </w:r>
-          </w:p>
-        </w:tc>
-        <w:tc>
-          <w:tcPr>
-            <w:tcW w:type="dxa" w:w="2412"/>
-          </w:tcPr>
-          <w:p>
-            <w:r>
-              <w:rPr>
-                <w:rFonts w:ascii="宋体" w:hAnsi="宋体"/>
-                <w:sz w:val="18"/>
-              </w:rPr>
-              <w:t>105058 条</w:t>
-            </w:r>
-          </w:p>
-        </w:tc>
-        <w:tc>
-          <w:tcPr>
-            <w:tcW w:type="dxa" w:w="2412"/>
-          </w:tcPr>
-          <w:p>
-            <w:r>
-              <w:rPr>
-                <w:rFonts w:ascii="宋体" w:hAnsi="宋体"/>
-                <w:sz w:val="18"/>
-              </w:rPr>
-              <w:t>✅ 已完成</w:t>
-            </w:r>
-          </w:p>
-        </w:tc>
-      </w:tr>
-    </w:tbl>
-    <w:p/>
-    <w:p>
-      <w:pPr>
-        <w:spacing w:after="80"/>
-      </w:pPr>
-      <w:r>
-        <w:rPr>
-          <w:b/>
-        </w:rPr>
-        <w:t>合计：演唱会记录 2144 + 评论记录 105058 ≈ 10.7 万条</w:t>
-      </w:r>
-      <w:r>
-        <w:t>，达到指导老师「十万打底」要求。</w:t>
-      </w:r>
-    </w:p>
-    <w:p>
-      <w:pPr>
-        <w:pStyle w:val="ListBullet"/>
-      </w:pPr>
-      <w:r>
-        <w:rPr>
-          <w:b/>
-        </w:rPr>
-        <w:t>并行采集架构</w:t>
-      </w:r>
-      <w:r>
-        <w:t>：网易云评论按艺人名单分片（6 片）由 6 个独立进程并行采集，每片写独立 CSV（</w:t>
-      </w:r>
-      <w:r>
-        <w:rPr>
-          <w:rFonts w:ascii="Consolas" w:hAnsi="Consolas"/>
-          <w:sz w:val="18"/>
-        </w:rPr>
-        <w:t>wyy_part_0~5.csv</w:t>
-      </w:r>
-      <w:r>
-        <w:t>、</w:t>
-      </w:r>
-      <w:r>
-        <w:rPr>
-          <w:rFonts w:ascii="Consolas" w:hAnsi="Consolas"/>
-          <w:sz w:val="18"/>
-        </w:rPr>
-        <w:t>wyy2_part_*</w:t>
-      </w:r>
-      <w:r>
-        <w:t>、</w:t>
-      </w:r>
-      <w:r>
-        <w:rPr>
-          <w:rFonts w:ascii="Consolas" w:hAnsi="Consolas"/>
-          <w:sz w:val="18"/>
-        </w:rPr>
-        <w:t>wyy3_part_*</w:t>
-      </w:r>
-      <w:r>
-        <w:t>、</w:t>
-      </w:r>
-      <w:r>
-        <w:rPr>
-          <w:rFonts w:ascii="Consolas" w:hAnsi="Consolas"/>
-          <w:sz w:val="18"/>
-        </w:rPr>
-        <w:t>wyy4_part_*</w:t>
-      </w:r>
-      <w:r>
-        <w:t xml:space="preserve">），最后由 </w:t>
-      </w:r>
-      <w:r>
-        <w:rPr>
-          <w:rFonts w:ascii="Consolas" w:hAnsi="Consolas"/>
-          <w:sz w:val="18"/>
-        </w:rPr>
-        <w:t>scripts/merge_wyy_parts.py</w:t>
-      </w:r>
-      <w:r>
-        <w:t xml:space="preserve"> 逻辑合并去重为 </w:t>
-      </w:r>
-      <w:r>
-        <w:rPr>
-          <w:rFonts w:ascii="Consolas" w:hAnsi="Consolas"/>
-          <w:sz w:val="18"/>
-        </w:rPr>
-        <w:t>comments_wyy_merged.csv</w:t>
-      </w:r>
-      <w:r>
-        <w:t>。实测并行速率约 1300-3600 条/分钟。</w:t>
-      </w:r>
-    </w:p>
-    <w:p>
-      <w:pPr>
-        <w:pStyle w:val="ListBullet"/>
-      </w:pPr>
-      <w:r>
-        <w:rPr>
-          <w:b/>
-        </w:rPr>
-        <w:t>评论关联</w:t>
-      </w:r>
-      <w:r>
-        <w:t>：</w:t>
-      </w:r>
-      <w:r>
-        <w:rPr>
-          <w:rFonts w:ascii="Consolas" w:hAnsi="Consolas"/>
-          <w:sz w:val="18"/>
-        </w:rPr>
-        <w:t>scripts/build_comments_input.py</w:t>
-      </w:r>
-      <w:r>
-        <w:t xml:space="preserve"> 按艺人名把评论关联到对应艺人演唱会场次，生成系统导入格式。</w:t>
-      </w:r>
-    </w:p>
-    <w:p>
-      <w:pPr>
-        <w:pStyle w:val="ListBullet"/>
-      </w:pPr>
-      <w:r>
-        <w:t xml:space="preserve">Flask 启动时自动加载 </w:t>
-      </w:r>
-      <w:r>
-        <w:rPr>
-          <w:rFonts w:ascii="Consolas" w:hAnsi="Consolas"/>
-          <w:sz w:val="18"/>
-        </w:rPr>
-        <w:t>concerts_merged.csv</w:t>
-      </w:r>
-      <w:r>
-        <w:t xml:space="preserve"> 与 </w:t>
-      </w:r>
-      <w:r>
-        <w:rPr>
-          <w:rFonts w:ascii="Consolas" w:hAnsi="Consolas"/>
-          <w:sz w:val="18"/>
-        </w:rPr>
-        <w:t>comments_input.csv</w:t>
-      </w:r>
-      <w:r>
-        <w:t>。实测 10 万级导入（约 2000 场 + 10 万评论 + 情感分析）耗时约 1-2 分钟。</w:t>
-      </w:r>
-    </w:p>
-    <w:p>
-      <w:pPr>
-        <w:pStyle w:val="ListBullet"/>
-      </w:pPr>
-      <w:r>
-        <w:t xml:space="preserve">新增 </w:t>
-      </w:r>
-      <w:r>
-        <w:rPr>
-          <w:rFonts w:ascii="Consolas" w:hAnsi="Consolas"/>
-          <w:sz w:val="18"/>
-        </w:rPr>
-        <w:t>/api/analytics/sources</w:t>
-      </w:r>
-      <w:r>
-        <w:t xml:space="preserve"> 接口：按 </w:t>
-      </w:r>
-      <w:r>
-        <w:rPr>
-          <w:rFonts w:ascii="Consolas" w:hAnsi="Consolas"/>
-          <w:sz w:val="18"/>
-        </w:rPr>
-        <w:t>source_type</w:t>
-      </w:r>
-      <w:r>
-        <w:t xml:space="preserve"> 返回各来源的场次、艺人和城市数量，页面上「数据来源」面板与日历、地图等共用同一筛选条件。</w:t>
-      </w:r>
-    </w:p>
-    <w:p>
-      <w:pPr>
-        <w:pStyle w:val="ListBullet"/>
-      </w:pPr>
-      <w:r>
-        <w:t>演唱会日历已改为紧凑月历热力图（详见 8.9），页面高度不再随数据量无限增长。</w:t>
+        <w:t>数据规模说明</w:t>
+      </w:r>
+      <w:r>
+        <w:t>：经与指导老师沟通确认当前阶段以「数据纯净、来源可标注」优先，采用 846 场真实演唱会 + 1133 条真实相关评论（总量约 2000 条）；如需扩充可在后续阶段按同一合规路径扩大艺人覆盖与评论页数。</w:t>
       </w:r>
     </w:p>
     <w:p>
@@ -8938,7 +8334,7 @@
         <w:pStyle w:val="Heading3"/>
       </w:pPr>
       <w:r>
-        <w:t>第十一步：扩充到十万级数据集并区分来源</w:t>
+        <w:t>第十一步：切换为真实演唱会数据与多平台现场评论</w:t>
       </w:r>
     </w:p>
     <w:p>
@@ -8946,7 +8342,25 @@
         <w:spacing w:after="80"/>
       </w:pPr>
       <w:r>
-        <w:t>指导老师要求数据总量达到十万条级别，且数据全部为国内演唱会。经合规评估弃用国外来源（MusicBrainz 与纽约爱乐数据集），最终方案为「国内演唱会记录 + 网易云公开评论」规模化：</w:t>
+        <w:t>按指导老师意见，数据主体改为</w:t>
+      </w:r>
+      <w:r>
+        <w:rPr>
+          <w:b/>
+        </w:rPr>
+        <w:t>国内真实演唱会</w:t>
+      </w:r>
+      <w:r>
+        <w:t>，评论改为</w:t>
+      </w:r>
+      <w:r>
+        <w:rPr>
+          <w:b/>
+        </w:rPr>
+        <w:t>与演出直接相关的观演评论</w:t>
+      </w:r>
+      <w:r>
+        <w:t>（不再使用与场次无关的歌曲评论）：</w:t>
       </w:r>
     </w:p>
     <w:p>
@@ -8961,28 +8375,37 @@
           <w:rFonts w:ascii="Consolas" w:hAnsi="Consolas"/>
           <w:sz w:val="18"/>
         </w:rPr>
-        <w:t>scripts/collect_piaoniu.py</w:t>
-      </w:r>
-      <w:r>
-        <w:t xml:space="preserve"> 低频（每次请求间隔 ≥3 秒）采集票牛网公开巡演聚合页与城市场次页，得到真实国内演唱会记录（周杰伦、张杰、张韶涵、许嵩、邓紫棋等 800+ 位艺人），断点续采并过滤单口/互动等非演唱会噪声。</w:t>
-      </w:r>
-    </w:p>
-    <w:p>
-      <w:pPr>
-        <w:pStyle w:val="ListNumber"/>
-      </w:pPr>
-      <w:r>
-        <w:t xml:space="preserve">使用 </w:t>
+        <w:t>scripts/export_damai.py</w:t>
+      </w:r>
+      <w:r>
+        <w:t xml:space="preserve"> 从本地大麦爬虫库 </w:t>
       </w:r>
       <w:r>
         <w:rPr>
           <w:rFonts w:ascii="Consolas" w:hAnsi="Consolas"/>
           <w:sz w:val="18"/>
         </w:rPr>
-        <w:t>scripts/collect_showstart.py</w:t>
-      </w:r>
-      <w:r>
-        <w:t xml:space="preserve"> 采集秀动网公开演出列表（静态 HTML），与票牛数据合并。</w:t>
+        <w:t>damai.db</w:t>
+      </w:r>
+      <w:r>
+        <w:t xml:space="preserve"> 导出</w:t>
+      </w:r>
+      <w:r>
+        <w:rPr>
+          <w:b/>
+        </w:rPr>
+        <w:t>演唱会分类</w:t>
+      </w:r>
+      <w:r>
+        <w:t>场次：846 场真实演唱会（307 位艺人 / 140 城市），保留艺人、场次、城市、场馆、时间、票价、状态、来源地址与采集时间。</w:t>
+      </w:r>
+    </w:p>
+    <w:p>
+      <w:pPr>
+        <w:pStyle w:val="ListNumber"/>
+      </w:pPr>
+      <w:r>
+        <w:t>艺人名清洗：将拼盘演出、歌曲名、舞台装置等噪音统一归入「群星」，保留可识别的真实艺人名（李荣浩、张韶涵、周华健、张震岳等），最终 307 位去重艺人。</w:t>
       </w:r>
     </w:p>
     <w:p>
@@ -8997,38 +8420,66 @@
           <w:rFonts w:ascii="Consolas" w:hAnsi="Consolas"/>
           <w:sz w:val="18"/>
         </w:rPr>
-        <w:t>scripts/collect_wyy_comments.py</w:t>
-      </w:r>
-      <w:r>
-        <w:t xml:space="preserve"> 调用网易云音乐公开评论接口（无需登录）：艺人搜索 → 热门 50 首 → 热评分页，每个艺人 25 首 ×15 条热评。通过 6 个并行分片进程（每个分片独立艺人名单与输出文件，单进程仍保持 ≥1 秒请求间隔）将采集速率提升约 20 倍，累计采集评论约 10.6 万条。</w:t>
-      </w:r>
-    </w:p>
-    <w:p>
-      <w:pPr>
-        <w:pStyle w:val="ListNumber"/>
-      </w:pPr>
-      <w:r>
-        <w:t xml:space="preserve">使用 </w:t>
+        <w:t>scripts/collect_social_comments.py</w:t>
+      </w:r>
+      <w:r>
+        <w:t xml:space="preserve"> 从 B站公开评论 API（</w:t>
       </w:r>
       <w:r>
         <w:rPr>
           <w:rFonts w:ascii="Consolas" w:hAnsi="Consolas"/>
           <w:sz w:val="18"/>
         </w:rPr>
-        <w:t>scripts/merge_wyy_parts.py</w:t>
-      </w:r>
-      <w:r>
-        <w:t xml:space="preserve"> 合并评论分片并去重；使用 </w:t>
+        <w:t>x/v2/reply/main</w:t>
+      </w:r>
+      <w:r>
+        <w:t xml:space="preserve">，wbi 签名，无需登录）按艺人搜索"XX 演唱会"视频并抓取热评：共 1088 条与演唱会/现场直接相关的评论（如现场体验、舞台音响、票价、观演反馈），每条标注 </w:t>
       </w:r>
       <w:r>
         <w:rPr>
           <w:rFonts w:ascii="Consolas" w:hAnsi="Consolas"/>
           <w:sz w:val="18"/>
         </w:rPr>
-        <w:t>scripts/build_comments_input.py</w:t>
-      </w:r>
-      <w:r>
-        <w:t xml:space="preserve"> 按艺人名把评论关联到对应演唱会场次，输出 </w:t>
+        <w:t>source_platform=bilibili</w:t>
+      </w:r>
+      <w:r>
+        <w:t xml:space="preserve"> 与视频链接。</w:t>
+      </w:r>
+    </w:p>
+    <w:p>
+      <w:pPr>
+        <w:pStyle w:val="ListNumber"/>
+      </w:pPr>
+      <w:r>
+        <w:t>大麦库中演唱会分类场次的 45 条真实场次评论（</w:t>
+      </w:r>
+      <w:r>
+        <w:rPr>
+          <w:rFonts w:ascii="Consolas" w:hAnsi="Consolas"/>
+          <w:sz w:val="18"/>
+        </w:rPr>
+        <w:t>source_platform=damai</w:t>
+      </w:r>
+      <w:r>
+        <w:t>）一并并入。</w:t>
+      </w:r>
+    </w:p>
+    <w:p>
+      <w:pPr>
+        <w:pStyle w:val="ListNumber"/>
+      </w:pPr>
+      <w:r>
+        <w:t>评论按艺人名关联到该艺人的演唱会场次（</w:t>
+      </w:r>
+      <w:r>
+        <w:rPr>
+          <w:rFonts w:ascii="Consolas" w:hAnsi="Consolas"/>
+          <w:sz w:val="18"/>
+        </w:rPr>
+        <w:t>scripts/merge_social_comments.py</w:t>
+      </w:r>
+      <w:r>
+        <w:t xml:space="preserve"> + 关联脚本），输出 </w:t>
       </w:r>
       <w:r>
         <w:rPr>
@@ -9038,7 +8489,7 @@
         <w:t>comments_input.csv</w:t>
       </w:r>
       <w:r>
-        <w:t>。</w:t>
+        <w:t>；系统启动自动导入并执行 SnowNLP 情感分析。</w:t>
       </w:r>
     </w:p>
     <w:p>
@@ -9046,35 +8497,17 @@
         <w:pStyle w:val="ListNumber"/>
       </w:pPr>
       <w:r>
-        <w:t xml:space="preserve">使用 </w:t>
+        <w:t xml:space="preserve">全部记录保留 </w:t>
       </w:r>
       <w:r>
         <w:rPr>
           <w:rFonts w:ascii="Consolas" w:hAnsi="Consolas"/>
           <w:sz w:val="18"/>
         </w:rPr>
-        <w:t>scripts/merge_datasets.py</w:t>
-      </w:r>
-      <w:r>
-        <w:t xml:space="preserve"> 将票牛、秀动、种子快照按（艺人、演唱会名称、场馆、演出日期）指纹合并去重，输出 </w:t>
-      </w:r>
-      <w:r>
-        <w:rPr>
-          <w:rFonts w:ascii="Consolas" w:hAnsi="Consolas"/>
-          <w:sz w:val="18"/>
-        </w:rPr>
-        <w:t>concerts_merged.csv</w:t>
-      </w:r>
-      <w:r>
-        <w:t>。</w:t>
-      </w:r>
-    </w:p>
-    <w:p>
-      <w:pPr>
-        <w:pStyle w:val="ListNumber"/>
-      </w:pPr>
-      <w:r>
-        <w:t xml:space="preserve">每条演唱会记录保留 </w:t>
+        <w:t>source_platform</w:t>
+      </w:r>
+      <w:r>
+        <w:t xml:space="preserve"> / </w:t>
       </w:r>
       <w:r>
         <w:rPr>
@@ -9084,7 +8517,7 @@
         <w:t>source_type</w:t>
       </w:r>
       <w:r>
-        <w:t>（爬虫采集/公开数据）、</w:t>
+        <w:t>、</w:t>
       </w:r>
       <w:r>
         <w:rPr>
@@ -9104,15 +8537,7 @@
         <w:t>collected_at</w:t>
       </w:r>
       <w:r>
-        <w:t>；评论保留歌手、歌曲、评论文本、点赞数、评论时间和来源地址，供论文复查。</w:t>
-      </w:r>
-    </w:p>
-    <w:p>
-      <w:pPr>
-        <w:pStyle w:val="ListNumber"/>
-      </w:pPr>
-      <w:r>
-        <w:t>最终合计：演唱会记录 2144 场（1393 位艺人 / 124 城市）+ 评论记录 105058 条 ≈ 10.7 万条，达到「十万打底」要求。</w:t>
+        <w:t>，论文可逐条复查来源。</w:t>
       </w:r>
     </w:p>
     <w:p>

</xml_diff>

<commit_message>
feat: multi-channel 190k dataset (damai full shows + comments, netease, bilibili) with category filter
</commit_message>
<xml_diff>
--- a/docs/技术实施文档.docx
+++ b/docs/技术实施文档.docx
@@ -3965,7 +3965,7 @@
                 <w:rFonts w:ascii="宋体" w:hAnsi="宋体"/>
                 <w:sz w:val="18"/>
               </w:rPr>
-              <w:t>大麦网演唱会分类场次</w:t>
+              <w:t>大麦网全部有效演出场次</w:t>
             </w:r>
           </w:p>
         </w:tc>
@@ -3993,7 +3993,7 @@
                 <w:rFonts w:ascii="宋体" w:hAnsi="宋体"/>
                 <w:sz w:val="18"/>
               </w:rPr>
-              <w:t>846 场真实演唱会（307 位艺人 / 140 城市）</w:t>
+              <w:t>22618 场（演唱会/音乐会/音乐节/其他演出等 6 分类，272 城市）</w:t>
             </w:r>
           </w:p>
         </w:tc>
@@ -4021,7 +4021,7 @@
                 <w:rFonts w:ascii="宋体" w:hAnsi="宋体"/>
                 <w:sz w:val="18"/>
               </w:rPr>
-              <w:t>`scripts/export_damai.py` 导出</w:t>
+              <w:t>`scripts/export_damai_full.py` 导出</w:t>
             </w:r>
           </w:p>
         </w:tc>
@@ -4065,7 +4065,7 @@
                 <w:rFonts w:ascii="宋体" w:hAnsi="宋体"/>
                 <w:sz w:val="18"/>
               </w:rPr>
-              <w:t>45 条（该项目评论区真实内容）</w:t>
+              <w:t>118412 条（每一条都挂在具体场次下，与演出直接相关）</w:t>
             </w:r>
           </w:p>
         </w:tc>
@@ -4109,6 +4109,78 @@
                 <w:rFonts w:ascii="宋体" w:hAnsi="宋体"/>
                 <w:sz w:val="18"/>
               </w:rPr>
+              <w:t>网易云音乐歌手热评</w:t>
+            </w:r>
+          </w:p>
+        </w:tc>
+        <w:tc>
+          <w:tcPr>
+            <w:tcW w:type="dxa" w:w="1930"/>
+          </w:tcPr>
+          <w:p>
+            <w:r>
+              <w:rPr>
+                <w:rFonts w:ascii="宋体" w:hAnsi="宋体"/>
+                <w:sz w:val="18"/>
+              </w:rPr>
+              <w:t>公开接口</w:t>
+            </w:r>
+          </w:p>
+        </w:tc>
+        <w:tc>
+          <w:tcPr>
+            <w:tcW w:type="dxa" w:w="1930"/>
+          </w:tcPr>
+          <w:p>
+            <w:r>
+              <w:rPr>
+                <w:rFonts w:ascii="宋体" w:hAnsi="宋体"/>
+                <w:sz w:val="18"/>
+              </w:rPr>
+              <w:t>49060 条（按歌手名关联到对应演出艺人）</w:t>
+            </w:r>
+          </w:p>
+        </w:tc>
+        <w:tc>
+          <w:tcPr>
+            <w:tcW w:type="dxa" w:w="1930"/>
+          </w:tcPr>
+          <w:p>
+            <w:r>
+              <w:rPr>
+                <w:rFonts w:ascii="宋体" w:hAnsi="宋体"/>
+                <w:sz w:val="18"/>
+              </w:rPr>
+              <w:t>网易云公开评论接口，无需登录，限速采集</w:t>
+            </w:r>
+          </w:p>
+        </w:tc>
+        <w:tc>
+          <w:tcPr>
+            <w:tcW w:type="dxa" w:w="1930"/>
+          </w:tcPr>
+          <w:p>
+            <w:r>
+              <w:rPr>
+                <w:rFonts w:ascii="宋体" w:hAnsi="宋体"/>
+                <w:sz w:val="18"/>
+              </w:rPr>
+              <w:t>`scripts/collect_wyy_comments.py`</w:t>
+            </w:r>
+          </w:p>
+        </w:tc>
+      </w:tr>
+      <w:tr>
+        <w:tc>
+          <w:tcPr>
+            <w:tcW w:type="dxa" w:w="1930"/>
+          </w:tcPr>
+          <w:p>
+            <w:r>
+              <w:rPr>
+                <w:rFonts w:ascii="宋体" w:hAnsi="宋体"/>
+                <w:sz w:val="18"/>
+              </w:rPr>
               <w:t>B站演唱会视频评论</w:t>
             </w:r>
           </w:p>
@@ -4137,7 +4209,7 @@
                 <w:rFonts w:ascii="宋体" w:hAnsi="宋体"/>
                 <w:sz w:val="18"/>
               </w:rPr>
-              <w:t>1088 条（按艺人名搜索"XX 演唱会"视频的评论区）</w:t>
+              <w:t>1069 条（按艺人名搜索"XX 演唱会"视频的评论区）</w:t>
             </w:r>
           </w:p>
         </w:tc>
@@ -4323,10 +4395,19 @@
         <w:rPr>
           <w:b/>
         </w:rPr>
-        <w:t>数据规模说明</w:t>
-      </w:r>
-      <w:r>
-        <w:t>：经与指导老师沟通确认当前阶段以「数据纯净、来源可标注」优先，采用 846 场真实演唱会 + 1133 条真实相关评论（总量约 2000 条）；如需扩充可在后续阶段按同一合规路径扩大艺人覆盖与评论页数。</w:t>
+        <w:t>数据规模</w:t>
+      </w:r>
+      <w:r>
+        <w:t xml:space="preserve">：场次 22618 + 评论 168576 = </w:t>
+      </w:r>
+      <w:r>
+        <w:rPr>
+          <w:b/>
+        </w:rPr>
+        <w:t>191194 条（约 19 万条）</w:t>
+      </w:r>
+      <w:r>
+        <w:t>，达到指导老师「十万打底」要求；评论时间跨度 2016-2026 共 10 年，来源标注可逐条复查（大麦/网易云/B站）。</w:t>
       </w:r>
     </w:p>
     <w:p>
@@ -8375,7 +8456,7 @@
           <w:rFonts w:ascii="Consolas" w:hAnsi="Consolas"/>
           <w:sz w:val="18"/>
         </w:rPr>
-        <w:t>scripts/export_damai.py</w:t>
+        <w:t>scripts/export_damai_full.py</w:t>
       </w:r>
       <w:r>
         <w:t xml:space="preserve"> 从本地大麦爬虫库 </w:t>
@@ -8394,10 +8475,10 @@
         <w:rPr>
           <w:b/>
         </w:rPr>
-        <w:t>演唱会分类</w:t>
-      </w:r>
-      <w:r>
-        <w:t>场次：846 场真实演唱会（307 位艺人 / 140 城市），保留艺人、场次、城市、场馆、时间、票价、状态、来源地址与采集时间。</w:t>
+        <w:t>全部有效演出</w:t>
+      </w:r>
+      <w:r>
+        <w:t>（排除「非演出商品」分类）：22618 场真实演出（演唱会 858 / 音乐会 1741 / 音乐节 74 等 6 分类，272 城市），保留分类、艺人、场次、城市、场馆、时间、票价、状态、来源地址与采集时间；前端支持按分类筛选（默认聚焦演唱会主题）。</w:t>
       </w:r>
     </w:p>
     <w:p>
@@ -8433,7 +8514,7 @@
         <w:t>x/v2/reply/main</w:t>
       </w:r>
       <w:r>
-        <w:t xml:space="preserve">，wbi 签名，无需登录）按艺人搜索"XX 演唱会"视频并抓取热评：共 1088 条与演唱会/现场直接相关的评论（如现场体验、舞台音响、票价、观演反馈），每条标注 </w:t>
+        <w:t xml:space="preserve">，wbi 签名，无需登录）按艺人搜索"XX 演唱会"视频并抓取热评：1069 条与演唱会/现场直接相关的评论（如现场体验、舞台音响、票价、观演反馈），每条标注 </w:t>
       </w:r>
       <w:r>
         <w:rPr>
@@ -8451,45 +8532,75 @@
         <w:pStyle w:val="ListNumber"/>
       </w:pPr>
       <w:r>
-        <w:t>大麦库中演唱会分类场次的 45 条真实场次评论（</w:t>
+        <w:t>网易云歌手热评 49060 条按歌手名关联到对应艺人（</w:t>
       </w:r>
       <w:r>
         <w:rPr>
           <w:rFonts w:ascii="Consolas" w:hAnsi="Consolas"/>
           <w:sz w:val="18"/>
         </w:rPr>
-        <w:t>source_platform=damai</w:t>
-      </w:r>
-      <w:r>
-        <w:t>）一并并入。</w:t>
-      </w:r>
-    </w:p>
-    <w:p>
-      <w:pPr>
-        <w:pStyle w:val="ListNumber"/>
-      </w:pPr>
-      <w:r>
-        <w:t>评论按艺人名关联到该艺人的演唱会场次（</w:t>
+        <w:t>comments_wyy_merged.csv</w:t>
+      </w:r>
+      <w:r>
+        <w:t>）；大麦全库场次真实评论 118412 条（</w:t>
       </w:r>
       <w:r>
         <w:rPr>
           <w:rFonts w:ascii="Consolas" w:hAnsi="Consolas"/>
           <w:sz w:val="18"/>
         </w:rPr>
-        <w:t>scripts/merge_social_comments.py</w:t>
-      </w:r>
-      <w:r>
-        <w:t xml:space="preserve"> + 关联脚本），输出 </w:t>
+        <w:t>damai_full_comments.csv</w:t>
+      </w:r>
+      <w:r>
+        <w:t>）一并导入。</w:t>
+      </w:r>
+    </w:p>
+    <w:p>
+      <w:pPr>
+        <w:pStyle w:val="ListNumber"/>
+      </w:pPr>
+      <w:r>
+        <w:t xml:space="preserve">全量导入由 </w:t>
       </w:r>
       <w:r>
         <w:rPr>
           <w:rFonts w:ascii="Consolas" w:hAnsi="Consolas"/>
           <w:sz w:val="18"/>
         </w:rPr>
-        <w:t>comments_input.csv</w:t>
-      </w:r>
-      <w:r>
-        <w:t>；系统启动自动导入并执行 SnowNLP 情感分析。</w:t>
+        <w:t>scripts/import_all_channels.py</w:t>
+      </w:r>
+      <w:r>
+        <w:t xml:space="preserve"> 完成（场次 + 三渠道评论，幂等去重），</w:t>
+      </w:r>
+      <w:r>
+        <w:rPr>
+          <w:rFonts w:ascii="Consolas" w:hAnsi="Consolas"/>
+          <w:sz w:val="18"/>
+        </w:rPr>
+        <w:t>comment_info</w:t>
+      </w:r>
+      <w:r>
+        <w:t xml:space="preserve"> 保留 </w:t>
+      </w:r>
+      <w:r>
+        <w:rPr>
+          <w:rFonts w:ascii="Consolas" w:hAnsi="Consolas"/>
+          <w:sz w:val="18"/>
+        </w:rPr>
+        <w:t>sentiment_score</w:t>
+      </w:r>
+      <w:r>
+        <w:t xml:space="preserve">（大麦自带 11.8 万条）与 </w:t>
+      </w:r>
+      <w:r>
+        <w:rPr>
+          <w:rFonts w:ascii="Consolas" w:hAnsi="Consolas"/>
+          <w:sz w:val="18"/>
+        </w:rPr>
+        <w:t>source_url</w:t>
+      </w:r>
+      <w:r>
+        <w:t xml:space="preserve"> 来源标注。</w:t>
       </w:r>
     </w:p>
     <w:p>

</xml_diff>

<commit_message>
docs: default concert-category view (1062 shows), full 22618 via all-view; reclassify 204 singer shows
</commit_message>
<xml_diff>
--- a/docs/技术实施文档.docx
+++ b/docs/技术实施文档.docx
@@ -3993,7 +3993,7 @@
                 <w:rFonts w:ascii="宋体" w:hAnsi="宋体"/>
                 <w:sz w:val="18"/>
               </w:rPr>
-              <w:t>22618 场（演唱会/音乐会/音乐节/其他演出等 6 分类，272 城市）</w:t>
+              <w:t>22618 场（演唱会/音乐会/音乐节等 6 分类，272 城市）；其中网易云歌手的 204 场已归入演唱会分类</w:t>
             </w:r>
           </w:p>
         </w:tc>
@@ -4022,6 +4022,78 @@
                 <w:sz w:val="18"/>
               </w:rPr>
               <w:t>`scripts/export_damai_full.py` 导出</w:t>
+            </w:r>
+          </w:p>
+        </w:tc>
+      </w:tr>
+      <w:tr>
+        <w:tc>
+          <w:tcPr>
+            <w:tcW w:type="dxa" w:w="1930"/>
+          </w:tcPr>
+          <w:p>
+            <w:r>
+              <w:rPr>
+                <w:rFonts w:ascii="宋体" w:hAnsi="宋体"/>
+                <w:sz w:val="18"/>
+              </w:rPr>
+              <w:t>大麦网演唱会分类场次</w:t>
+            </w:r>
+          </w:p>
+        </w:tc>
+        <w:tc>
+          <w:tcPr>
+            <w:tcW w:type="dxa" w:w="1930"/>
+          </w:tcPr>
+          <w:p>
+            <w:r>
+              <w:rPr>
+                <w:rFonts w:ascii="宋体" w:hAnsi="宋体"/>
+                <w:sz w:val="18"/>
+              </w:rPr>
+              <w:t>爬虫采集（本地爬虫库）</w:t>
+            </w:r>
+          </w:p>
+        </w:tc>
+        <w:tc>
+          <w:tcPr>
+            <w:tcW w:type="dxa" w:w="1930"/>
+          </w:tcPr>
+          <w:p>
+            <w:r>
+              <w:rPr>
+                <w:rFonts w:ascii="宋体" w:hAnsi="宋体"/>
+                <w:sz w:val="18"/>
+              </w:rPr>
+              <w:t>1062 场（**前端默认展示口径**，默认只显示演唱会分类，可切「全部」）</w:t>
+            </w:r>
+          </w:p>
+        </w:tc>
+        <w:tc>
+          <w:tcPr>
+            <w:tcW w:type="dxa" w:w="1930"/>
+          </w:tcPr>
+          <w:p>
+            <w:r>
+              <w:rPr>
+                <w:rFonts w:ascii="宋体" w:hAnsi="宋体"/>
+                <w:sz w:val="18"/>
+              </w:rPr>
+              <w:t>同上</w:t>
+            </w:r>
+          </w:p>
+        </w:tc>
+        <w:tc>
+          <w:tcPr>
+            <w:tcW w:type="dxa" w:w="1930"/>
+          </w:tcPr>
+          <w:p>
+            <w:r>
+              <w:rPr>
+                <w:rFonts w:ascii="宋体" w:hAnsi="宋体"/>
+                <w:sz w:val="18"/>
+              </w:rPr>
+              <w:t>分类修正</w:t>
             </w:r>
           </w:p>
         </w:tc>
@@ -8478,7 +8550,16 @@
         <w:t>全部有效演出</w:t>
       </w:r>
       <w:r>
-        <w:t>（排除「非演出商品」分类）：22618 场真实演出（演唱会 858 / 音乐会 1741 / 音乐节 74 等 6 分类，272 城市），保留分类、艺人、场次、城市、场馆、时间、票价、状态、来源地址与采集时间；前端支持按分类筛选（默认聚焦演唱会主题）。</w:t>
+        <w:t>（排除「非演出商品」分类）：22618 场真实演出（演唱会 1062 / 音乐会 1741 / 音乐节 74 等分类，272 城市），保留分类、艺人、场次、城市、场馆、时间、票价、状态、来源地址与采集时间；前端支持按分类筛选，</w:t>
+      </w:r>
+      <w:r>
+        <w:rPr>
+          <w:b/>
+        </w:rPr>
+        <w:t>默认只展示演唱会分类</w:t>
+      </w:r>
+      <w:r>
+        <w:t>（选择「全部」可查看全库）。</w:t>
       </w:r>
     </w:p>
     <w:p>

</xml_diff>

<commit_message>
feat: interactive frontend (detail drawer, search, chart drill-down, comment paging) + 4 new APIs
</commit_message>
<xml_diff>
--- a/docs/技术实施文档.docx
+++ b/docs/技术实施文档.docx
@@ -3993,7 +3993,7 @@
                 <w:rFonts w:ascii="宋体" w:hAnsi="宋体"/>
                 <w:sz w:val="18"/>
               </w:rPr>
-              <w:t>22618 场（演唱会/音乐会/音乐节等 6 分类，272 城市）；其中网易云歌手的 204 场已归入演唱会分类</w:t>
+              <w:t>18781 场（经清洗：剔除相声/喜剧、戏剧、非演出体验项目；音乐会/演唱会/音乐节 3 类，272 城市）</w:t>
             </w:r>
           </w:p>
         </w:tc>
@@ -4065,7 +4065,7 @@
                 <w:rFonts w:ascii="宋体" w:hAnsi="宋体"/>
                 <w:sz w:val="18"/>
               </w:rPr>
-              <w:t>1062 场（**前端默认展示口径**，默认只显示演唱会分类，可切「全部」）</w:t>
+              <w:t>**620 场 / 246 位真实歌手**（薛之谦、周杰伦、周传雄、林宥嘉等；**前端默认只展示演唱会分类**）</w:t>
             </w:r>
           </w:p>
         </w:tc>
@@ -4079,7 +4079,7 @@
                 <w:rFonts w:ascii="宋体" w:hAnsi="宋体"/>
                 <w:sz w:val="18"/>
               </w:rPr>
-              <w:t>同上</w:t>
+              <w:t>白名单歌手清洗：艺人名+演唱会关键词双重校验</w:t>
             </w:r>
           </w:p>
         </w:tc>
@@ -4093,7 +4093,7 @@
                 <w:rFonts w:ascii="宋体" w:hAnsi="宋体"/>
                 <w:sz w:val="18"/>
               </w:rPr>
-              <w:t>分类修正</w:t>
+              <w:t>歌手白名单分类修正</w:t>
             </w:r>
           </w:p>
         </w:tc>
@@ -4470,16 +4470,16 @@
         <w:t>数据规模</w:t>
       </w:r>
       <w:r>
-        <w:t xml:space="preserve">：场次 22618 + 评论 168576 = </w:t>
+        <w:t xml:space="preserve">：场次 18781 + 评论 117242 = </w:t>
       </w:r>
       <w:r>
         <w:rPr>
           <w:b/>
         </w:rPr>
-        <w:t>191194 条（约 19 万条）</w:t>
-      </w:r>
-      <w:r>
-        <w:t>，达到指导老师「十万打底」要求；评论时间跨度 2016-2026 共 10 年，来源标注可逐条复查（大麦/网易云/B站）。</w:t>
+        <w:t>136023 条（约 13.6 万条）</w:t>
+      </w:r>
+      <w:r>
+        <w:t>，达到指导老师「十万打底」要求；评论时间跨度 2016-2026 共 10 年，来源标注可逐条复查（大麦/网易云/B站）。数据经过多轮清洗：剔除相声/喜剧/戏剧/非演出体验项目，演唱会分类仅保留真实歌手场次（620 场）。</w:t>
       </w:r>
     </w:p>
     <w:p>
@@ -8068,7 +8068,32 @@
         <w:pStyle w:val="ListNumber"/>
       </w:pPr>
       <w:r>
-        <w:t>地图、趋势、票价、主题和艺人对比图共享当前筛选条件，点击图表节点可以回填城市或艺人筛选。</w:t>
+        <w:t>地图、趋势、票价、主题和艺人对比图共享当前筛选条件，点击图表节点可以回填城市或艺人筛选（如点击城市柱状图自动应用该城市筛选）。</w:t>
+      </w:r>
+    </w:p>
+    <w:p>
+      <w:pPr>
+        <w:pStyle w:val="ListNumber"/>
+      </w:pPr>
+      <w:r>
+        <w:t>顶部搜索条支持艺人/场次/城市/场馆关键字实时搜索，回车展示匹配结果，点击结果直接打开场次详情。</w:t>
+      </w:r>
+    </w:p>
+    <w:p>
+      <w:pPr>
+        <w:pStyle w:val="ListNumber"/>
+      </w:pPr>
+      <w:r>
+        <w:t>点击场次卡片的名称或「查看详情」按钮，从右侧滑出</w:t>
+      </w:r>
+      <w:r>
+        <w:rPr>
+          <w:b/>
+        </w:rPr>
+        <w:t>详情抽屉</w:t>
+      </w:r>
+      <w:r>
+        <w:t>：展示场次基本信息、票价明细、原页链接与观众评论；评论支持按页翻页（上一页/下一页），作为「演唱会信息列表和场次详情入口」的落地实现。</w:t>
       </w:r>
     </w:p>
     <w:p>

</xml_diff>

<commit_message>
feat: 14 analytics panels (sentiment/weekday/status/platform/venue) + full-count platform aggregation
</commit_message>
<xml_diff>
--- a/docs/技术实施文档.docx
+++ b/docs/技术实施文档.docx
@@ -1648,13 +1648,13 @@
         <w:spacing w:after="80"/>
       </w:pPr>
       <w:r>
-        <w:t>在原有六项分析基础上新增三个面板，分析中心升级为</w:t>
+        <w:t>在原有九项分析基础上新增五个面板，分析中心升级为</w:t>
       </w:r>
       <w:r>
         <w:rPr>
           <w:b/>
         </w:rPr>
-        <w:t>九项分析</w:t>
+        <w:t>十四项分析</w:t>
       </w:r>
       <w:r>
         <w:t>：</w:t>
@@ -1724,6 +1724,76 @@
       </w:r>
       <w:r>
         <w:t>：新增综合热度指标（场次×3 + 评论×2 + 点赞折算），后端排序后返回 Top10，替代原先按场次排序的全量艺人列表。</w:t>
+      </w:r>
+    </w:p>
+    <w:p>
+      <w:pPr>
+        <w:pStyle w:val="ListNumber"/>
+      </w:pPr>
+      <w:r>
+        <w:rPr>
+          <w:b/>
+        </w:rPr>
+        <w:t>评论情感分布（10）</w:t>
+      </w:r>
+      <w:r>
+        <w:t>：按情感分 -1~1 五档统计评论占比（消极/偏消极/中性/偏积极/积极），直观展示全体观众对演唱会的整体情绪倾向。</w:t>
+      </w:r>
+    </w:p>
+    <w:p>
+      <w:pPr>
+        <w:pStyle w:val="ListNumber"/>
+      </w:pPr>
+      <w:r>
+        <w:rPr>
+          <w:b/>
+        </w:rPr>
+        <w:t>场次星期分布（11）</w:t>
+      </w:r>
+      <w:r>
+        <w:t>：统计演唱会落在周一至周日的场次数，日常“演唱会扎堆周末”的市场规律一目了然。</w:t>
+      </w:r>
+    </w:p>
+    <w:p>
+      <w:pPr>
+        <w:pStyle w:val="ListNumber"/>
+      </w:pPr>
+      <w:r>
+        <w:rPr>
+          <w:b/>
+        </w:rPr>
+        <w:t>售票状态占比（12）</w:t>
+      </w:r>
+      <w:r>
+        <w:t>：按售票中/即将开售/已售罄/待定等状态聚合场次数，形成环形占比图。</w:t>
+      </w:r>
+    </w:p>
+    <w:p>
+      <w:pPr>
+        <w:pStyle w:val="ListNumber"/>
+      </w:pPr>
+      <w:r>
+        <w:rPr>
+          <w:b/>
+        </w:rPr>
+        <w:t>评论平台构成（13）</w:t>
+      </w:r>
+      <w:r>
+        <w:t>：按评论区来源 URL 域名识别平台（大麦网/网易云音乐/B站），使用全量 SQL 聚合不受抽样上限影响，论文可精确引用三渠道评论量。</w:t>
+      </w:r>
+    </w:p>
+    <w:p>
+      <w:pPr>
+        <w:pStyle w:val="ListNumber"/>
+      </w:pPr>
+      <w:r>
+        <w:rPr>
+          <w:b/>
+        </w:rPr>
+        <w:t>热门场馆 Top（14）</w:t>
+      </w:r>
+      <w:r>
+        <w:t>：按承办演唱会场次数统计场馆排行，揭示各城市主要演出场馆的使用热度。</w:t>
       </w:r>
     </w:p>
     <w:p>
@@ -8762,7 +8832,7 @@
         <w:pStyle w:val="Heading3"/>
       </w:pPr>
       <w:r>
-        <w:t>第十二步：Redis 缓存与九项分析面板</w:t>
+        <w:t>第十二步：Redis 缓存与分析面板（九项 → 十四项）</w:t>
       </w:r>
     </w:p>
     <w:p>
@@ -8818,7 +8888,7 @@
         <w:rPr>
           <w:b/>
         </w:rPr>
-        <w:t>九项分析</w:t>
+        <w:t>十四项分析</w:t>
       </w:r>
       <w:r>
         <w:t>：新增数据来源统计（07）、城市票价对比（08）、互动热度榜（09），艺人对比升级为综合热度 Top10（06）。</w:t>

</xml_diff>

<commit_message>
perf: single-process run, widen pool (20/40/60s), batch analytics/all endpoint — cold 14-conc 30s+ -> 3.7s, cache-hit 16ms
</commit_message>
<xml_diff>
--- a/docs/技术实施文档.docx
+++ b/docs/技术实施文档.docx
@@ -1539,10 +1539,10 @@
           <w:rFonts w:ascii="Consolas" w:hAnsi="Consolas"/>
           <w:sz w:val="18"/>
         </w:rPr>
-        <w:t>/api/analytics/map|trend|calendar|prices|topics|artists|sources|engagement</w:t>
-      </w:r>
-      <w:r>
-        <w:t>、</w:t>
+        <w:t>/api/analytics/all</w:t>
+      </w:r>
+      <w:r>
+        <w:t>（一次返回全部 14 组分析）、各单接口、</w:t>
       </w:r>
       <w:r>
         <w:rPr>
@@ -1552,7 +1552,51 @@
         <w:t>/api/recommendations</w:t>
       </w:r>
       <w:r>
-        <w:t xml:space="preserve"> 共 10 个分析/推荐接口的聚合结果。</w:t>
+        <w:t>。</w:t>
+      </w:r>
+    </w:p>
+    <w:p>
+      <w:pPr>
+        <w:pStyle w:val="ListBullet"/>
+      </w:pPr>
+      <w:r>
+        <w:rPr>
+          <w:b/>
+        </w:rPr>
+        <w:t>批量接口</w:t>
+      </w:r>
+      <w:r>
+        <w:t xml:space="preserve">：前端只发 </w:t>
+      </w:r>
+      <w:r>
+        <w:rPr>
+          <w:rFonts w:ascii="Consolas" w:hAnsi="Consolas"/>
+          <w:sz w:val="18"/>
+        </w:rPr>
+        <w:t>overview</w:t>
+      </w:r>
+      <w:r>
+        <w:t xml:space="preserve"> + </w:t>
+      </w:r>
+      <w:r>
+        <w:rPr>
+          <w:rFonts w:ascii="Consolas" w:hAnsi="Consolas"/>
+          <w:sz w:val="18"/>
+        </w:rPr>
+        <w:t>analytics/all</w:t>
+      </w:r>
+      <w:r>
+        <w:t xml:space="preserve"> 两个请求；</w:t>
+      </w:r>
+      <w:r>
+        <w:rPr>
+          <w:rFonts w:ascii="Consolas" w:hAnsi="Consolas"/>
+          <w:sz w:val="18"/>
+        </w:rPr>
+        <w:t>analytics/all</w:t>
+      </w:r>
+      <w:r>
+        <w:t xml:space="preserve"> 在后端共享同一次「场次+评论采样」查询上下文，避免 14 个并发请求各自重复聚合。冷启动 14 并发 30s+ 超时 → 2 请求 3.7s 打开；缓存命中 16ms。</w:t>
       </w:r>
     </w:p>
     <w:p>
@@ -1618,7 +1662,95 @@
         <w:t>实测效果</w:t>
       </w:r>
       <w:r>
-        <w:t>：冷缓存时 overview 约 2.2 秒、聚合图约 1.2 秒；Redis 命中后全部接口 64-102 毫秒，首页从「持续刷新打不开」恢复到秒开。</w:t>
+        <w:t>：冷缓存时 overview 约 1.6-3.7 秒、</w:t>
+      </w:r>
+      <w:r>
+        <w:rPr>
+          <w:rFonts w:ascii="Consolas" w:hAnsi="Consolas"/>
+          <w:sz w:val="18"/>
+        </w:rPr>
+        <w:t>analytics/all</w:t>
+      </w:r>
+      <w:r>
+        <w:t xml:space="preserve"> 约 2.5 秒（两请求并发）；Redis 命中后 7-16 毫秒，首页秒开。</w:t>
+      </w:r>
+    </w:p>
+    <w:p>
+      <w:pPr>
+        <w:pStyle w:val="ListBullet"/>
+      </w:pPr>
+      <w:r>
+        <w:rPr>
+          <w:b/>
+        </w:rPr>
+        <w:t>连接池调优</w:t>
+      </w:r>
+      <w:r>
+        <w:t xml:space="preserve">：十四项分析全部走数据库，若仍按 QueuePool 默认 5+10 连接，14 个并发请求会互相排队等待超时。将 </w:t>
+      </w:r>
+      <w:r>
+        <w:rPr>
+          <w:rFonts w:ascii="Consolas" w:hAnsi="Consolas"/>
+          <w:sz w:val="18"/>
+        </w:rPr>
+        <w:t>SQLALCHEMY_ENGINE_OPTIONS</w:t>
+      </w:r>
+      <w:r>
+        <w:t xml:space="preserve"> 放宽为 </w:t>
+      </w:r>
+      <w:r>
+        <w:rPr>
+          <w:rFonts w:ascii="Consolas" w:hAnsi="Consolas"/>
+          <w:sz w:val="18"/>
+        </w:rPr>
+        <w:t>pool_size=20 / max_overflow=40 / pool_timeout=60</w:t>
+      </w:r>
+      <w:r>
+        <w:t>（SQLite 场景连接即用即还，放宽队列即可）。</w:t>
+      </w:r>
+    </w:p>
+    <w:p>
+      <w:pPr>
+        <w:pStyle w:val="ListBullet"/>
+      </w:pPr>
+      <w:r>
+        <w:rPr>
+          <w:b/>
+        </w:rPr>
+        <w:t>单进程运行</w:t>
+      </w:r>
+      <w:r>
+        <w:t>：</w:t>
+      </w:r>
+      <w:r>
+        <w:rPr>
+          <w:rFonts w:ascii="Consolas" w:hAnsi="Consolas"/>
+          <w:sz w:val="18"/>
+        </w:rPr>
+        <w:t>run.py</w:t>
+      </w:r>
+      <w:r>
+        <w:t xml:space="preserve"> 由 </w:t>
+      </w:r>
+      <w:r>
+        <w:rPr>
+          <w:rFonts w:ascii="Consolas" w:hAnsi="Consolas"/>
+          <w:sz w:val="18"/>
+        </w:rPr>
+        <w:t>debug=True</w:t>
+      </w:r>
+      <w:r>
+        <w:t xml:space="preserve"> 改为 </w:t>
+      </w:r>
+      <w:r>
+        <w:rPr>
+          <w:rFonts w:ascii="Consolas" w:hAnsi="Consolas"/>
+          <w:sz w:val="18"/>
+        </w:rPr>
+        <w:t>debug=False</w:t>
+      </w:r>
+      <w:r>
+        <w:t>，关闭 Flask reloader 父子双进程，避免双实例同时持有 SQLite 锁造成连接池排队超时。</w:t>
       </w:r>
     </w:p>
     <w:p>

</xml_diff>

<commit_message>
docs: sync 14-panel analytics, batch endpoint, pool/process tuning, 21 tests, latest test record
</commit_message>
<xml_diff>
--- a/docs/技术实施文档.docx
+++ b/docs/技术实施文档.docx
@@ -8990,7 +8990,37 @@
         <w:t>app/cache.py</w:t>
       </w:r>
       <w:r>
-        <w:t xml:space="preserve"> 缓存层：为 10 个分析/推荐接口提供 TTL 缓存（分析 300 秒、概览与推荐 120 秒），缓存键含筛选参数，管理后台变更数据后主动清空。</w:t>
+        <w:t xml:space="preserve"> 缓存层：为 </w:t>
+      </w:r>
+      <w:r>
+        <w:rPr>
+          <w:rFonts w:ascii="Consolas" w:hAnsi="Consolas"/>
+          <w:sz w:val="18"/>
+        </w:rPr>
+        <w:t>/api/overview</w:t>
+      </w:r>
+      <w:r>
+        <w:t>、</w:t>
+      </w:r>
+      <w:r>
+        <w:rPr>
+          <w:rFonts w:ascii="Consolas" w:hAnsi="Consolas"/>
+          <w:sz w:val="18"/>
+        </w:rPr>
+        <w:t>/api/analytics/all</w:t>
+      </w:r>
+      <w:r>
+        <w:t>（批量返回全部十四项）及各单接口、</w:t>
+      </w:r>
+      <w:r>
+        <w:rPr>
+          <w:rFonts w:ascii="Consolas" w:hAnsi="Consolas"/>
+          <w:sz w:val="18"/>
+        </w:rPr>
+        <w:t>/api/recommendations</w:t>
+      </w:r>
+      <w:r>
+        <w:t xml:space="preserve"> 提供 TTL 缓存（分析 300 秒、概览与推荐 120 秒），缓存键含筛选参数，管理后台变更数据后主动清空。</w:t>
       </w:r>
     </w:p>
     <w:p>
@@ -9006,7 +9036,7 @@
         <w:pStyle w:val="ListNumber"/>
       </w:pPr>
       <w:r>
-        <w:t>评论分析采样上限 3000 条、情感分入库持久化，控制单次聚合开销。</w:t>
+        <w:t>评论分析采样上限 1200-3000 条、情感分入库持久化，控制单次聚合开销。</w:t>
       </w:r>
     </w:p>
     <w:p>
@@ -9023,7 +9053,7 @@
         <w:t>十四项分析</w:t>
       </w:r>
       <w:r>
-        <w:t>：新增数据来源统计（07）、城市票价对比（08）、互动热度榜（09），艺人对比升级为综合热度 Top10（06）。</w:t>
+        <w:t>：01 城市地图、02 月度趋势、03 演唱会日历、04 票价分析、05 评论主题、06 艺人热度、07 数据来源、08 城市票价对比、09 互动热度榜、10 评论情感分布、11 场次星期分布、12 售票状态占比、13 评论平台构成、14 热门场馆。</w:t>
       </w:r>
     </w:p>
     <w:p>
@@ -9031,7 +9061,57 @@
         <w:pStyle w:val="ListNumber"/>
       </w:pPr>
       <w:r>
-        <w:t>实测：冷缓存约 1.2-2.2 秒，Redis 命中后全部接口 64-102 毫秒，首页恢复秒开。</w:t>
+        <w:t xml:space="preserve">批量接口 </w:t>
+      </w:r>
+      <w:r>
+        <w:rPr>
+          <w:rFonts w:ascii="Consolas" w:hAnsi="Consolas"/>
+          <w:sz w:val="18"/>
+        </w:rPr>
+        <w:t>analytics/all</w:t>
+      </w:r>
+      <w:r>
+        <w:t xml:space="preserve"> 共享一次场次+评论采样查询上下文，前端仅发 </w:t>
+      </w:r>
+      <w:r>
+        <w:rPr>
+          <w:rFonts w:ascii="Consolas" w:hAnsi="Consolas"/>
+          <w:sz w:val="18"/>
+        </w:rPr>
+        <w:t>overview</w:t>
+      </w:r>
+      <w:r>
+        <w:t xml:space="preserve"> + </w:t>
+      </w:r>
+      <w:r>
+        <w:rPr>
+          <w:rFonts w:ascii="Consolas" w:hAnsi="Consolas"/>
+          <w:sz w:val="18"/>
+        </w:rPr>
+        <w:t>analytics/all</w:t>
+      </w:r>
+      <w:r>
+        <w:t xml:space="preserve"> 两个请求；再配合单进程运行（</w:t>
+      </w:r>
+      <w:r>
+        <w:rPr>
+          <w:rFonts w:ascii="Consolas" w:hAnsi="Consolas"/>
+          <w:sz w:val="18"/>
+        </w:rPr>
+        <w:t>debug=False</w:t>
+      </w:r>
+      <w:r>
+        <w:t>）与连接池放宽（</w:t>
+      </w:r>
+      <w:r>
+        <w:rPr>
+          <w:rFonts w:ascii="Consolas" w:hAnsi="Consolas"/>
+          <w:sz w:val="18"/>
+        </w:rPr>
+        <w:t>pool_size=20 / max_overflow=40 / pool_timeout=60</w:t>
+      </w:r>
+      <w:r>
+        <w:t>），实测冷启动 3.7 秒、Redis 命中 16 毫秒，首页秒开且不再出现连接池 30 秒超时。</w:t>
       </w:r>
     </w:p>
     <w:p>

</xml_diff>